<commit_message>
Add final exam materials and course Codex plugins
Add 2025-26 final and mock final exam TeX/PDF files, refresh project and linear-regression course materials, and register local QMH Codex plugins and agents.
</commit_message>
<xml_diff>
--- a/10_RUBRICS/G351-QMH-Rubric-Project.docx
+++ b/10_RUBRICS/G351-QMH-Rubric-Project.docx
@@ -32,7 +32,6 @@
               <w:tl2br w:val="none" w:sz="0" w:space="0" w:color="auto"/>
               <w:tr2bl w:val="none" w:sz="0" w:space="0" w:color="auto"/>
             </w:tcBorders>
-            <w:shd w:val="clear" w:color="auto" w:fill="auto"/>
             <w:vAlign w:val="center"/>
           </w:tcPr>
           <w:p>
@@ -166,7 +165,6 @@
               <w:tl2br w:val="none" w:sz="0" w:space="0" w:color="auto"/>
               <w:tr2bl w:val="none" w:sz="0" w:space="0" w:color="auto"/>
             </w:tcBorders>
-            <w:shd w:val="clear" w:color="auto" w:fill="auto"/>
             <w:vAlign w:val="center"/>
           </w:tcPr>
           <w:p>
@@ -265,7 +263,6 @@
         <w:tc>
           <w:tcPr>
             <w:tcW w:w="1843" w:type="dxa"/>
-            <w:shd w:val="clear" w:color="auto" w:fill="auto"/>
             <w:vAlign w:val="center"/>
           </w:tcPr>
           <w:p>
@@ -328,7 +325,6 @@
         <w:tc>
           <w:tcPr>
             <w:tcW w:w="1701" w:type="dxa"/>
-            <w:shd w:val="clear" w:color="auto" w:fill="auto"/>
             <w:vAlign w:val="center"/>
           </w:tcPr>
           <w:p>
@@ -407,7 +403,6 @@
         <w:tc>
           <w:tcPr>
             <w:tcW w:w="1843" w:type="dxa"/>
-            <w:shd w:val="clear" w:color="auto" w:fill="auto"/>
             <w:vAlign w:val="center"/>
           </w:tcPr>
           <w:p>
@@ -472,7 +467,6 @@
         <w:tc>
           <w:tcPr>
             <w:tcW w:w="1701" w:type="dxa"/>
-            <w:shd w:val="clear" w:color="auto" w:fill="auto"/>
             <w:vAlign w:val="center"/>
           </w:tcPr>
           <w:p>
@@ -560,7 +554,6 @@
         <w:tc>
           <w:tcPr>
             <w:tcW w:w="1843" w:type="dxa"/>
-            <w:shd w:val="clear" w:color="auto" w:fill="auto"/>
             <w:vAlign w:val="center"/>
           </w:tcPr>
           <w:p>
@@ -625,14 +618,37 @@
               <w:rPr>
                 <w:rFonts w:cstheme="minorHAnsi"/>
               </w:rPr>
-              <w:t>09/05/2025</w:t>
+              <w:t>27</w:t>
+            </w:r>
+            <w:r>
+              <w:rPr>
+                <w:rFonts w:cstheme="minorHAnsi"/>
+              </w:rPr>
+              <w:t>/0</w:t>
+            </w:r>
+            <w:r>
+              <w:rPr>
+                <w:rFonts w:cstheme="minorHAnsi"/>
+              </w:rPr>
+              <w:t>4</w:t>
+            </w:r>
+            <w:r>
+              <w:rPr>
+                <w:rFonts w:cstheme="minorHAnsi"/>
+              </w:rPr>
+              <w:t>/202</w:t>
+            </w:r>
+            <w:r>
+              <w:rPr>
+                <w:rFonts w:cstheme="minorHAnsi"/>
+              </w:rPr>
+              <w:t>6</w:t>
             </w:r>
           </w:p>
         </w:tc>
         <w:tc>
           <w:tcPr>
             <w:tcW w:w="1701" w:type="dxa"/>
-            <w:shd w:val="clear" w:color="auto" w:fill="auto"/>
             <w:vAlign w:val="center"/>
           </w:tcPr>
           <w:p>
@@ -765,7 +781,7 @@
           <w:szCs w:val="20"/>
           <w:lang w:val="en-GB"/>
         </w:rPr>
-        <w:t xml:space="preserve">Project </w:t>
+        <w:t xml:space="preserve">Project applying course concepts to real-world data using statistical software to study causal relations. Submission by deadline.</w:t>
       </w:r>
       <w:r>
         <w:rPr>
@@ -773,7 +789,7 @@
           <w:szCs w:val="20"/>
           <w:lang w:val="en-GB"/>
         </w:rPr>
-        <w:t>a</w:t>
+        <w:t/>
       </w:r>
       <w:r>
         <w:rPr>
@@ -781,7 +797,7 @@
           <w:szCs w:val="20"/>
           <w:lang w:val="en-GB"/>
         </w:rPr>
-        <w:t>pply</w:t>
+        <w:t/>
       </w:r>
       <w:r>
         <w:rPr>
@@ -789,7 +805,7 @@
           <w:szCs w:val="20"/>
           <w:lang w:val="en-GB"/>
         </w:rPr>
-        <w:t>ing</w:t>
+        <w:t/>
       </w:r>
       <w:r>
         <w:rPr>
@@ -797,7 +813,7 @@
           <w:szCs w:val="20"/>
           <w:lang w:val="en-GB"/>
         </w:rPr>
-        <w:t xml:space="preserve"> course concepts to real-world data using statistical software</w:t>
+        <w:t xml:space="preserve"/>
       </w:r>
       <w:r>
         <w:rPr>
@@ -805,7 +821,7 @@
           <w:szCs w:val="20"/>
           <w:lang w:val="en-GB"/>
         </w:rPr>
-        <w:t xml:space="preserve"> to study causal relations</w:t>
+        <w:t xml:space="preserve"/>
       </w:r>
       <w:r>
         <w:rPr>
@@ -813,7 +829,7 @@
           <w:szCs w:val="20"/>
           <w:lang w:val="en-GB"/>
         </w:rPr>
-        <w:t>. Submission by deadline</w:t>
+        <w:t/>
       </w:r>
       <w:r>
         <w:rPr>
@@ -821,7 +837,7 @@
           <w:szCs w:val="20"/>
           <w:lang w:val="en-GB"/>
         </w:rPr>
-        <w:t xml:space="preserve"> and </w:t>
+        <w:t xml:space="preserve"/>
       </w:r>
       <w:r>
         <w:rPr>
@@ -829,7 +845,7 @@
           <w:szCs w:val="20"/>
           <w:lang w:val="en-GB"/>
         </w:rPr>
-        <w:t xml:space="preserve">oral </w:t>
+        <w:t xml:space="preserve"/>
       </w:r>
       <w:r>
         <w:rPr>
@@ -837,7 +853,7 @@
           <w:szCs w:val="20"/>
           <w:lang w:val="en-GB"/>
         </w:rPr>
-        <w:t>presentation.</w:t>
+        <w:t/>
       </w:r>
     </w:p>
     <w:p>
@@ -888,104 +904,24 @@
         </w:rPr>
       </w:pPr>
       <w:r>
-        <w:rPr>
-          <w:sz w:val="20"/>
-          <w:szCs w:val="20"/>
-          <w:lang w:val="en-GB"/>
-        </w:rPr>
-        <w:t xml:space="preserve">The project final grade consists of 50% oral presentation </w:t>
-      </w:r>
-      <w:r>
-        <w:rPr>
-          <w:sz w:val="20"/>
-          <w:szCs w:val="20"/>
-          <w:lang w:val="en-GB"/>
-        </w:rPr>
-        <w:t xml:space="preserve">plus 50% written report. </w:t>
-      </w:r>
-      <w:r>
-        <w:rPr>
-          <w:sz w:val="20"/>
-          <w:szCs w:val="20"/>
-          <w:lang w:val="en-GB"/>
-        </w:rPr>
-        <w:t xml:space="preserve">Due to the open nature of the project guidelines, there are not rigid questions </w:t>
-      </w:r>
-      <w:r>
-        <w:rPr>
-          <w:sz w:val="20"/>
-          <w:szCs w:val="20"/>
-          <w:lang w:val="en-GB"/>
-        </w:rPr>
-        <w:t>with</w:t>
-      </w:r>
-      <w:r>
-        <w:rPr>
-          <w:sz w:val="20"/>
-          <w:szCs w:val="20"/>
-          <w:lang w:val="en-GB"/>
-        </w:rPr>
-        <w:t xml:space="preserve"> prescribed point</w:t>
-      </w:r>
-      <w:r>
-        <w:rPr>
-          <w:sz w:val="20"/>
-          <w:szCs w:val="20"/>
-          <w:lang w:val="en-GB"/>
-        </w:rPr>
-        <w:t xml:space="preserve"> values</w:t>
-      </w:r>
-      <w:r>
-        <w:rPr>
-          <w:sz w:val="20"/>
-          <w:szCs w:val="20"/>
-          <w:lang w:val="en-GB"/>
-        </w:rPr>
-        <w:t xml:space="preserve">. Rather, both the project presentation and written report are evaluated in terms of </w:t>
-      </w:r>
-      <w:r>
-        <w:rPr>
-          <w:sz w:val="20"/>
-          <w:szCs w:val="20"/>
-          <w:lang w:val="en-GB"/>
-        </w:rPr>
-        <w:t>the following key concepts</w:t>
-      </w:r>
-      <w:r>
-        <w:rPr>
-          <w:sz w:val="20"/>
-          <w:szCs w:val="20"/>
-          <w:lang w:val="en-GB"/>
-        </w:rPr>
-        <w:t>:</w:t>
-      </w:r>
-      <w:r>
-        <w:rPr>
-          <w:sz w:val="20"/>
-          <w:szCs w:val="20"/>
-          <w:lang w:val="en-GB"/>
-        </w:rPr>
-        <w:br/>
+        <w:t>The project final grade is based on a written report. Due to the open nature of the project guidelines, there are not rigid questions with prescribed point values. Rather, written reports are evaluated in terms of the following key concepts:</w:t>
       </w:r>
     </w:p>
     <w:p>
       <w:pPr>
-        <w:pStyle w:val="ListParagraph"/>
-        <w:tabs>
-          <w:tab w:val="left" w:pos="5149"/>
-        </w:tabs>
-        <w:ind w:left="0"/>
-        <w:jc w:val="both"/>
-        <w:rPr>
-          <w:sz w:val="20"/>
-          <w:szCs w:val="20"/>
-          <w:lang w:val="en-GB"/>
-        </w:rPr>
-      </w:pPr>
-    </w:p>
-    <w:p>
-      <w:pPr>
         <w:jc w:val="center"/>
+        <w:rPr>
+          <w:rFonts w:cstheme="minorHAnsi"/>
+          <w:b/>
+          <w:bCs/>
+          <w:smallCaps/>
+          <w:color w:val="FF5700"/>
+          <w:sz w:val="16"/>
+          <w:szCs w:val="16"/>
+          <w:lang w:val="en-US"/>
+        </w:rPr>
+      </w:pPr>
+      <w:r>
         <w:rPr>
           <w:rFonts w:cstheme="minorHAnsi"/>
           <w:b/>
@@ -996,7 +932,8 @@
           <w:szCs w:val="20"/>
           <w:lang w:val="en-US"/>
         </w:rPr>
-      </w:pPr>
+        <w:t xml:space="preserve">Rubric for </w:t>
+      </w:r>
       <w:r>
         <w:rPr>
           <w:rFonts w:cstheme="minorHAnsi"/>
@@ -1008,7 +945,7 @@
           <w:szCs w:val="20"/>
           <w:lang w:val="en-US"/>
         </w:rPr>
-        <w:t>Rubric for oral presentation</w:t>
+        <w:t xml:space="preserve">the project </w:t>
       </w:r>
       <w:r>
         <w:rPr>
@@ -1021,736 +958,7 @@
           <w:szCs w:val="20"/>
           <w:lang w:val="en-US"/>
         </w:rPr>
-        <w:br/>
-      </w:r>
-      <w:r>
-        <w:rPr>
-          <w:rFonts w:cstheme="minorHAnsi"/>
-          <w:b/>
-          <w:bCs/>
-          <w:smallCaps/>
-          <w:color w:val="FF5700"/>
-          <w:sz w:val="16"/>
-          <w:szCs w:val="16"/>
-          <w:lang w:val="en-US"/>
-        </w:rPr>
-        <w:t>Total of 10 points</w:t>
-      </w:r>
-    </w:p>
-    <w:tbl>
-      <w:tblPr>
-        <w:tblW w:w="9317" w:type="dxa"/>
-        <w:tblCellSpacing w:w="15" w:type="dxa"/>
-        <w:tblCellMar>
-          <w:top w:w="15" w:type="dxa"/>
-          <w:left w:w="15" w:type="dxa"/>
-          <w:bottom w:w="15" w:type="dxa"/>
-          <w:right w:w="15" w:type="dxa"/>
-        </w:tblCellMar>
-        <w:tblLook w:val="04A0" w:firstRow="1" w:lastRow="0" w:firstColumn="1" w:lastColumn="0" w:noHBand="0" w:noVBand="1"/>
-      </w:tblPr>
-      <w:tblGrid>
-        <w:gridCol w:w="81"/>
-        <w:gridCol w:w="2043"/>
-        <w:gridCol w:w="6440"/>
-        <w:gridCol w:w="753"/>
-      </w:tblGrid>
-      <w:tr>
-        <w:trPr>
-          <w:trHeight w:val="476"/>
-          <w:tblHeader/>
-          <w:tblCellSpacing w:w="15" w:type="dxa"/>
-        </w:trPr>
-        <w:tc>
-          <w:tcPr>
-            <w:tcW w:w="0" w:type="auto"/>
-            <w:vAlign w:val="center"/>
-            <w:hideMark/>
-          </w:tcPr>
-          <w:p>
-            <w:pPr>
-              <w:rPr>
-                <w:b/>
-                <w:bCs/>
-                <w:sz w:val="20"/>
-                <w:szCs w:val="20"/>
-                <w:lang w:val="en-GB"/>
-              </w:rPr>
-            </w:pPr>
-          </w:p>
-        </w:tc>
-        <w:tc>
-          <w:tcPr>
-            <w:tcW w:w="0" w:type="auto"/>
-            <w:vAlign w:val="center"/>
-            <w:hideMark/>
-          </w:tcPr>
-          <w:p>
-            <w:pPr>
-              <w:rPr>
-                <w:rFonts w:cstheme="minorHAnsi"/>
-                <w:b/>
-                <w:bCs/>
-                <w:smallCaps/>
-                <w:color w:val="FF5700"/>
-                <w:sz w:val="20"/>
-                <w:szCs w:val="20"/>
-                <w:lang w:val="en-US"/>
-              </w:rPr>
-            </w:pPr>
-            <w:r>
-              <w:rPr>
-                <w:rFonts w:cstheme="minorHAnsi"/>
-                <w:b/>
-                <w:bCs/>
-                <w:smallCaps/>
-                <w:color w:val="FF5700"/>
-                <w:sz w:val="20"/>
-                <w:szCs w:val="20"/>
-                <w:lang w:val="en-US"/>
-              </w:rPr>
-              <w:t>Concept</w:t>
-            </w:r>
-          </w:p>
-        </w:tc>
-        <w:tc>
-          <w:tcPr>
-            <w:tcW w:w="0" w:type="auto"/>
-            <w:vAlign w:val="center"/>
-            <w:hideMark/>
-          </w:tcPr>
-          <w:p>
-            <w:pPr>
-              <w:rPr>
-                <w:rFonts w:cstheme="minorHAnsi"/>
-                <w:b/>
-                <w:bCs/>
-                <w:smallCaps/>
-                <w:color w:val="FF5700"/>
-                <w:sz w:val="20"/>
-                <w:szCs w:val="20"/>
-                <w:lang w:val="en-US"/>
-              </w:rPr>
-            </w:pPr>
-            <w:r>
-              <w:rPr>
-                <w:rFonts w:cstheme="minorHAnsi"/>
-                <w:b/>
-                <w:bCs/>
-                <w:smallCaps/>
-                <w:color w:val="FF5700"/>
-                <w:sz w:val="20"/>
-                <w:szCs w:val="20"/>
-                <w:lang w:val="en-US"/>
-              </w:rPr>
-              <w:t>Definition</w:t>
-            </w:r>
-          </w:p>
-        </w:tc>
-        <w:tc>
-          <w:tcPr>
-            <w:tcW w:w="0" w:type="auto"/>
-            <w:vAlign w:val="center"/>
-            <w:hideMark/>
-          </w:tcPr>
-          <w:p>
-            <w:pPr>
-              <w:rPr>
-                <w:rFonts w:cstheme="minorHAnsi"/>
-                <w:b/>
-                <w:bCs/>
-                <w:smallCaps/>
-                <w:color w:val="FF5700"/>
-                <w:sz w:val="20"/>
-                <w:szCs w:val="20"/>
-                <w:lang w:val="en-US"/>
-              </w:rPr>
-            </w:pPr>
-            <w:r>
-              <w:rPr>
-                <w:rFonts w:cstheme="minorHAnsi"/>
-                <w:b/>
-                <w:bCs/>
-                <w:smallCaps/>
-                <w:color w:val="FF5700"/>
-                <w:sz w:val="20"/>
-                <w:szCs w:val="20"/>
-                <w:lang w:val="en-US"/>
-              </w:rPr>
-              <w:t>Weight</w:t>
-            </w:r>
-          </w:p>
-        </w:tc>
-      </w:tr>
-      <w:tr>
-        <w:trPr>
-          <w:trHeight w:val="1075"/>
-          <w:tblCellSpacing w:w="15" w:type="dxa"/>
-        </w:trPr>
-        <w:tc>
-          <w:tcPr>
-            <w:tcW w:w="0" w:type="auto"/>
-            <w:vAlign w:val="center"/>
-            <w:hideMark/>
-          </w:tcPr>
-          <w:p>
-            <w:pPr>
-              <w:rPr>
-                <w:sz w:val="20"/>
-                <w:szCs w:val="20"/>
-              </w:rPr>
-            </w:pPr>
-          </w:p>
-        </w:tc>
-        <w:tc>
-          <w:tcPr>
-            <w:tcW w:w="0" w:type="auto"/>
-            <w:vAlign w:val="center"/>
-            <w:hideMark/>
-          </w:tcPr>
-          <w:p>
-            <w:pPr>
-              <w:rPr>
-                <w:sz w:val="20"/>
-                <w:szCs w:val="20"/>
-              </w:rPr>
-            </w:pPr>
-            <w:r>
-              <w:rPr>
-                <w:b/>
-                <w:bCs/>
-                <w:sz w:val="20"/>
-                <w:szCs w:val="20"/>
-              </w:rPr>
-              <w:t xml:space="preserve">Causal </w:t>
-            </w:r>
-            <w:proofErr w:type="spellStart"/>
-            <w:r>
-              <w:rPr>
-                <w:b/>
-                <w:bCs/>
-                <w:sz w:val="20"/>
-                <w:szCs w:val="20"/>
-              </w:rPr>
-              <w:t>Questions</w:t>
-            </w:r>
-            <w:proofErr w:type="spellEnd"/>
-            <w:r>
-              <w:rPr>
-                <w:b/>
-                <w:bCs/>
-                <w:sz w:val="20"/>
-                <w:szCs w:val="20"/>
-              </w:rPr>
-              <w:t xml:space="preserve"> &amp; </w:t>
-            </w:r>
-            <w:proofErr w:type="spellStart"/>
-            <w:r>
-              <w:rPr>
-                <w:b/>
-                <w:bCs/>
-                <w:sz w:val="20"/>
-                <w:szCs w:val="20"/>
-              </w:rPr>
-              <w:t>Theory</w:t>
-            </w:r>
-            <w:proofErr w:type="spellEnd"/>
-          </w:p>
-        </w:tc>
-        <w:tc>
-          <w:tcPr>
-            <w:tcW w:w="0" w:type="auto"/>
-            <w:vAlign w:val="center"/>
-            <w:hideMark/>
-          </w:tcPr>
-          <w:p>
-            <w:pPr>
-              <w:rPr>
-                <w:sz w:val="20"/>
-                <w:szCs w:val="20"/>
-                <w:lang w:val="en-GB"/>
-              </w:rPr>
-            </w:pPr>
-            <w:r>
-              <w:rPr>
-                <w:sz w:val="20"/>
-                <w:szCs w:val="20"/>
-                <w:lang w:val="en-GB"/>
-              </w:rPr>
-              <w:t>Clearly stating the causal questions and solution method. Naming treatment</w:t>
-            </w:r>
-            <w:r>
-              <w:rPr>
-                <w:rFonts w:ascii="Arial" w:hAnsi="Arial" w:cs="Arial"/>
-                <w:sz w:val="20"/>
-                <w:szCs w:val="20"/>
-                <w:lang w:val="en-GB"/>
-              </w:rPr>
-              <w:t> and </w:t>
-            </w:r>
-            <w:r>
-              <w:rPr>
-                <w:sz w:val="20"/>
-                <w:szCs w:val="20"/>
-                <w:lang w:val="en-GB"/>
-              </w:rPr>
-              <w:t xml:space="preserve">outcome clearly. </w:t>
-            </w:r>
-            <w:r>
-              <w:rPr>
-                <w:sz w:val="20"/>
-                <w:szCs w:val="20"/>
-                <w:lang w:val="en-GB"/>
-              </w:rPr>
-              <w:t>Mentioning</w:t>
-            </w:r>
-            <w:r>
-              <w:rPr>
-                <w:sz w:val="20"/>
-                <w:szCs w:val="20"/>
-                <w:lang w:val="en-GB"/>
-              </w:rPr>
-              <w:t xml:space="preserve"> randomization</w:t>
-            </w:r>
-            <w:r>
-              <w:rPr>
-                <w:sz w:val="20"/>
-                <w:szCs w:val="20"/>
-                <w:lang w:val="en-GB"/>
-              </w:rPr>
-              <w:t xml:space="preserve"> check</w:t>
-            </w:r>
-            <w:r>
-              <w:rPr>
-                <w:sz w:val="20"/>
-                <w:szCs w:val="20"/>
-                <w:lang w:val="en-GB"/>
-              </w:rPr>
-              <w:t xml:space="preserve"> and identifying the </w:t>
-            </w:r>
-            <w:r>
-              <w:rPr>
-                <w:sz w:val="20"/>
-                <w:szCs w:val="20"/>
-                <w:lang w:val="en-GB"/>
-              </w:rPr>
-              <w:t xml:space="preserve">appropriate </w:t>
-            </w:r>
-            <w:r>
-              <w:rPr>
-                <w:sz w:val="20"/>
-                <w:szCs w:val="20"/>
-                <w:lang w:val="en-GB"/>
-              </w:rPr>
-              <w:t>study design.</w:t>
-            </w:r>
-          </w:p>
-        </w:tc>
-        <w:tc>
-          <w:tcPr>
-            <w:tcW w:w="0" w:type="auto"/>
-            <w:vAlign w:val="center"/>
-            <w:hideMark/>
-          </w:tcPr>
-          <w:p>
-            <w:pPr>
-              <w:jc w:val="center"/>
-              <w:rPr>
-                <w:sz w:val="20"/>
-                <w:szCs w:val="20"/>
-              </w:rPr>
-            </w:pPr>
-            <w:r>
-              <w:rPr>
-                <w:sz w:val="20"/>
-                <w:szCs w:val="20"/>
-              </w:rPr>
-              <w:t>25%</w:t>
-            </w:r>
-          </w:p>
-        </w:tc>
-      </w:tr>
-      <w:tr>
-        <w:trPr>
-          <w:trHeight w:val="776"/>
-          <w:tblCellSpacing w:w="15" w:type="dxa"/>
-        </w:trPr>
-        <w:tc>
-          <w:tcPr>
-            <w:tcW w:w="0" w:type="auto"/>
-            <w:vAlign w:val="center"/>
-            <w:hideMark/>
-          </w:tcPr>
-          <w:p>
-            <w:pPr>
-              <w:rPr>
-                <w:sz w:val="20"/>
-                <w:szCs w:val="20"/>
-              </w:rPr>
-            </w:pPr>
-          </w:p>
-        </w:tc>
-        <w:tc>
-          <w:tcPr>
-            <w:tcW w:w="0" w:type="auto"/>
-            <w:vAlign w:val="center"/>
-            <w:hideMark/>
-          </w:tcPr>
-          <w:p>
-            <w:pPr>
-              <w:rPr>
-                <w:sz w:val="20"/>
-                <w:szCs w:val="20"/>
-              </w:rPr>
-            </w:pPr>
-            <w:proofErr w:type="spellStart"/>
-            <w:r>
-              <w:rPr>
-                <w:b/>
-                <w:bCs/>
-                <w:sz w:val="20"/>
-                <w:szCs w:val="20"/>
-              </w:rPr>
-              <w:t>Exposition</w:t>
-            </w:r>
-            <w:proofErr w:type="spellEnd"/>
-            <w:r>
-              <w:rPr>
-                <w:b/>
-                <w:bCs/>
-                <w:sz w:val="20"/>
-                <w:szCs w:val="20"/>
-              </w:rPr>
-              <w:t xml:space="preserve"> </w:t>
-            </w:r>
-            <w:proofErr w:type="spellStart"/>
-            <w:r>
-              <w:rPr>
-                <w:b/>
-                <w:bCs/>
-                <w:sz w:val="20"/>
-                <w:szCs w:val="20"/>
-              </w:rPr>
-              <w:t>of</w:t>
-            </w:r>
-            <w:proofErr w:type="spellEnd"/>
-            <w:r>
-              <w:rPr>
-                <w:b/>
-                <w:bCs/>
-                <w:sz w:val="20"/>
-                <w:szCs w:val="20"/>
-              </w:rPr>
-              <w:t xml:space="preserve"> ideas</w:t>
-            </w:r>
-          </w:p>
-        </w:tc>
-        <w:tc>
-          <w:tcPr>
-            <w:tcW w:w="0" w:type="auto"/>
-            <w:vAlign w:val="center"/>
-            <w:hideMark/>
-          </w:tcPr>
-          <w:p>
-            <w:pPr>
-              <w:rPr>
-                <w:sz w:val="20"/>
-                <w:szCs w:val="20"/>
-                <w:lang w:val="en-GB"/>
-              </w:rPr>
-            </w:pPr>
-            <w:r>
-              <w:rPr>
-                <w:sz w:val="20"/>
-                <w:szCs w:val="20"/>
-                <w:lang w:val="en-GB"/>
-              </w:rPr>
-              <w:t>Clear communication. No ambiguity. Correct language and exposition of ideas and findings.</w:t>
-            </w:r>
-          </w:p>
-        </w:tc>
-        <w:tc>
-          <w:tcPr>
-            <w:tcW w:w="0" w:type="auto"/>
-            <w:vAlign w:val="center"/>
-            <w:hideMark/>
-          </w:tcPr>
-          <w:p>
-            <w:pPr>
-              <w:jc w:val="center"/>
-              <w:rPr>
-                <w:sz w:val="20"/>
-                <w:szCs w:val="20"/>
-              </w:rPr>
-            </w:pPr>
-            <w:r>
-              <w:rPr>
-                <w:sz w:val="20"/>
-                <w:szCs w:val="20"/>
-              </w:rPr>
-              <w:t>30%</w:t>
-            </w:r>
-          </w:p>
-        </w:tc>
-      </w:tr>
-      <w:tr>
-        <w:trPr>
-          <w:trHeight w:val="784"/>
-          <w:tblCellSpacing w:w="15" w:type="dxa"/>
-        </w:trPr>
-        <w:tc>
-          <w:tcPr>
-            <w:tcW w:w="0" w:type="auto"/>
-            <w:vAlign w:val="center"/>
-            <w:hideMark/>
-          </w:tcPr>
-          <w:p>
-            <w:pPr>
-              <w:rPr>
-                <w:sz w:val="20"/>
-                <w:szCs w:val="20"/>
-              </w:rPr>
-            </w:pPr>
-          </w:p>
-        </w:tc>
-        <w:tc>
-          <w:tcPr>
-            <w:tcW w:w="0" w:type="auto"/>
-            <w:vAlign w:val="center"/>
-            <w:hideMark/>
-          </w:tcPr>
-          <w:p>
-            <w:pPr>
-              <w:rPr>
-                <w:sz w:val="20"/>
-                <w:szCs w:val="20"/>
-              </w:rPr>
-            </w:pPr>
-            <w:r>
-              <w:rPr>
-                <w:b/>
-                <w:bCs/>
-                <w:sz w:val="20"/>
-                <w:szCs w:val="20"/>
-              </w:rPr>
-              <w:t xml:space="preserve">Informative </w:t>
-            </w:r>
-            <w:proofErr w:type="spellStart"/>
-            <w:r>
-              <w:rPr>
-                <w:b/>
-                <w:bCs/>
-                <w:sz w:val="20"/>
-                <w:szCs w:val="20"/>
-              </w:rPr>
-              <w:t>Slides</w:t>
-            </w:r>
-            <w:proofErr w:type="spellEnd"/>
-          </w:p>
-        </w:tc>
-        <w:tc>
-          <w:tcPr>
-            <w:tcW w:w="0" w:type="auto"/>
-            <w:vAlign w:val="center"/>
-            <w:hideMark/>
-          </w:tcPr>
-          <w:p>
-            <w:pPr>
-              <w:rPr>
-                <w:sz w:val="20"/>
-                <w:szCs w:val="20"/>
-                <w:lang w:val="en-GB"/>
-              </w:rPr>
-            </w:pPr>
-            <w:r>
-              <w:rPr>
-                <w:sz w:val="20"/>
-                <w:szCs w:val="20"/>
-                <w:lang w:val="en-GB"/>
-              </w:rPr>
-              <w:t>Slides effectively supporting the talk. Graphs and metrics illustrating concepts.</w:t>
-            </w:r>
-          </w:p>
-        </w:tc>
-        <w:tc>
-          <w:tcPr>
-            <w:tcW w:w="0" w:type="auto"/>
-            <w:vAlign w:val="center"/>
-            <w:hideMark/>
-          </w:tcPr>
-          <w:p>
-            <w:pPr>
-              <w:jc w:val="center"/>
-              <w:rPr>
-                <w:sz w:val="20"/>
-                <w:szCs w:val="20"/>
-              </w:rPr>
-            </w:pPr>
-            <w:r>
-              <w:rPr>
-                <w:sz w:val="20"/>
-                <w:szCs w:val="20"/>
-              </w:rPr>
-              <w:t>25%</w:t>
-            </w:r>
-          </w:p>
-        </w:tc>
-      </w:tr>
-      <w:tr>
-        <w:trPr>
-          <w:trHeight w:val="1075"/>
-          <w:tblCellSpacing w:w="15" w:type="dxa"/>
-        </w:trPr>
-        <w:tc>
-          <w:tcPr>
-            <w:tcW w:w="0" w:type="auto"/>
-            <w:vAlign w:val="center"/>
-            <w:hideMark/>
-          </w:tcPr>
-          <w:p>
-            <w:pPr>
-              <w:rPr>
-                <w:sz w:val="20"/>
-                <w:szCs w:val="20"/>
-              </w:rPr>
-            </w:pPr>
-          </w:p>
-        </w:tc>
-        <w:tc>
-          <w:tcPr>
-            <w:tcW w:w="0" w:type="auto"/>
-            <w:vAlign w:val="center"/>
-            <w:hideMark/>
-          </w:tcPr>
-          <w:p>
-            <w:pPr>
-              <w:rPr>
-                <w:sz w:val="20"/>
-                <w:szCs w:val="20"/>
-              </w:rPr>
-            </w:pPr>
-            <w:proofErr w:type="spellStart"/>
-            <w:r>
-              <w:rPr>
-                <w:b/>
-                <w:bCs/>
-                <w:sz w:val="20"/>
-                <w:szCs w:val="20"/>
-              </w:rPr>
-              <w:t>Communication</w:t>
-            </w:r>
-            <w:proofErr w:type="spellEnd"/>
-            <w:r>
-              <w:rPr>
-                <w:b/>
-                <w:bCs/>
-                <w:sz w:val="20"/>
-                <w:szCs w:val="20"/>
-              </w:rPr>
-              <w:t xml:space="preserve"> &amp; </w:t>
-            </w:r>
-            <w:proofErr w:type="spellStart"/>
-            <w:r>
-              <w:rPr>
-                <w:b/>
-                <w:bCs/>
-                <w:sz w:val="20"/>
-                <w:szCs w:val="20"/>
-              </w:rPr>
-              <w:t>Engagement</w:t>
-            </w:r>
-            <w:proofErr w:type="spellEnd"/>
-          </w:p>
-        </w:tc>
-        <w:tc>
-          <w:tcPr>
-            <w:tcW w:w="0" w:type="auto"/>
-            <w:vAlign w:val="center"/>
-            <w:hideMark/>
-          </w:tcPr>
-          <w:p>
-            <w:pPr>
-              <w:rPr>
-                <w:sz w:val="20"/>
-                <w:szCs w:val="20"/>
-                <w:lang w:val="en-GB"/>
-              </w:rPr>
-            </w:pPr>
-            <w:r>
-              <w:rPr>
-                <w:sz w:val="20"/>
-                <w:szCs w:val="20"/>
-                <w:lang w:val="en-GB"/>
-              </w:rPr>
-              <w:t>Slides uncluttered. Figures/tables readable. Talk within allotted time. Engaging speech. No reading the slides. Answers to Q&amp;A.</w:t>
-            </w:r>
-          </w:p>
-        </w:tc>
-        <w:tc>
-          <w:tcPr>
-            <w:tcW w:w="0" w:type="auto"/>
-            <w:vAlign w:val="center"/>
-            <w:hideMark/>
-          </w:tcPr>
-          <w:p>
-            <w:pPr>
-              <w:jc w:val="center"/>
-              <w:rPr>
-                <w:sz w:val="20"/>
-                <w:szCs w:val="20"/>
-              </w:rPr>
-            </w:pPr>
-            <w:r>
-              <w:rPr>
-                <w:sz w:val="20"/>
-                <w:szCs w:val="20"/>
-              </w:rPr>
-              <w:t>20%</w:t>
-            </w:r>
-          </w:p>
-        </w:tc>
-      </w:tr>
-    </w:tbl>
-    <w:p>
-      <w:pPr>
-        <w:jc w:val="center"/>
-        <w:rPr>
-          <w:lang w:val="en-GB"/>
-        </w:rPr>
-      </w:pPr>
-      <w:r>
-        <w:rPr>
-          <w:lang w:val="en-GB"/>
-        </w:rPr>
-        <w:tab/>
-      </w:r>
-    </w:p>
-    <w:p>
-      <w:pPr>
-        <w:jc w:val="center"/>
-        <w:rPr>
-          <w:rFonts w:cstheme="minorHAnsi"/>
-          <w:b/>
-          <w:bCs/>
-          <w:smallCaps/>
-          <w:color w:val="FF5700"/>
-          <w:sz w:val="16"/>
-          <w:szCs w:val="16"/>
-          <w:lang w:val="en-US"/>
-        </w:rPr>
-      </w:pPr>
-      <w:r>
-        <w:rPr>
-          <w:rFonts w:cstheme="minorHAnsi"/>
-          <w:b/>
-          <w:bCs/>
-          <w:smallCaps/>
-          <w:color w:val="FF5700"/>
-          <w:sz w:val="20"/>
-          <w:szCs w:val="20"/>
-          <w:lang w:val="en-US"/>
-        </w:rPr>
-        <w:t>Rubric for written report</w:t>
+        <w:t>written report</w:t>
       </w:r>
       <w:r>
         <w:rPr>
@@ -1973,7 +1181,7 @@
                 <w:szCs w:val="20"/>
                 <w:lang w:val="en-GB"/>
               </w:rPr>
-              <w:t>Clear definition of treatment/control. Checking the randomization. Richness of the causal study.</w:t>
+              <w:t>Treatment/control, outcome, randomization or identifying assumption, and appropriate comparisons.</w:t>
             </w:r>
           </w:p>
         </w:tc>
@@ -2028,7 +1236,6 @@
                 <w:sz w:val="20"/>
                 <w:szCs w:val="20"/>
               </w:rPr>
-              <w:lastRenderedPageBreak/>
               <w:t>Interpretation</w:t>
             </w:r>
             <w:proofErr w:type="spellEnd"/>
@@ -2054,7 +1261,7 @@
                 <w:szCs w:val="20"/>
                 <w:lang w:val="en-GB"/>
               </w:rPr>
-              <w:t>In-code comments interpreting magnitude and direction of effects. Clear narrative and sound conclusions.</w:t>
+              <w:t>Direction, magnitude, substantive meaning, limitations, and conclusions.</w:t>
             </w:r>
           </w:p>
         </w:tc>
@@ -2101,7 +1308,6 @@
                 <w:szCs w:val="20"/>
               </w:rPr>
             </w:pPr>
-            <w:proofErr w:type="spellStart"/>
             <w:r>
               <w:rPr>
                 <w:b/>
@@ -2109,17 +1315,7 @@
                 <w:sz w:val="20"/>
                 <w:szCs w:val="20"/>
               </w:rPr>
-              <w:t>Code</w:t>
-            </w:r>
-            <w:proofErr w:type="spellEnd"/>
-            <w:r>
-              <w:rPr>
-                <w:b/>
-                <w:bCs/>
-                <w:sz w:val="20"/>
-                <w:szCs w:val="20"/>
-              </w:rPr>
-              <w:t xml:space="preserve"> </w:t>
+              <w:t xml:space="preserve">Code </w:t>
             </w:r>
             <w:proofErr w:type="spellStart"/>
             <w:r>
@@ -2154,7 +1350,7 @@
                 <w:szCs w:val="20"/>
                 <w:lang w:val="en-GB"/>
               </w:rPr>
-              <w:t>Readable code that runs without errors</w:t>
+              <w:t>Readable, reproducible R code, correct variable construction, and code that runs without errors.</w:t>
             </w:r>
           </w:p>
         </w:tc>
@@ -2219,27 +1415,7 @@
                 <w:sz w:val="20"/>
                 <w:szCs w:val="20"/>
               </w:rPr>
-              <w:t xml:space="preserve"> </w:t>
-            </w:r>
-            <w:proofErr w:type="spellStart"/>
-            <w:r>
-              <w:rPr>
-                <w:b/>
-                <w:bCs/>
-                <w:sz w:val="20"/>
-                <w:szCs w:val="20"/>
-              </w:rPr>
-              <w:t>Clarity</w:t>
-            </w:r>
-            <w:proofErr w:type="spellEnd"/>
-            <w:r>
-              <w:rPr>
-                <w:b/>
-                <w:bCs/>
-                <w:sz w:val="20"/>
-                <w:szCs w:val="20"/>
-              </w:rPr>
-              <w:t xml:space="preserve"> &amp; </w:t>
+              <w:t xml:space="preserve"> Clarity &amp; </w:t>
             </w:r>
             <w:proofErr w:type="spellStart"/>
             <w:r>
@@ -2274,7 +1450,7 @@
                 <w:szCs w:val="20"/>
                 <w:lang w:val="en-GB"/>
               </w:rPr>
-              <w:t>Logical sectioning (headings/chunk comments), consistent naming, no typos or grammatical errors, conciseness</w:t>
+              <w:t>Well organized, concise, readable tables/figures, and polished writing.</w:t>
             </w:r>
           </w:p>
         </w:tc>
@@ -2304,14 +1480,12 @@
       </w:tr>
       <w:tr>
         <w:trPr>
-          <w:trHeight w:val="1"/>
           <w:tblCellSpacing w:w="15" w:type="dxa"/>
         </w:trPr>
         <w:tc>
           <w:tcPr>
             <w:tcW w:w="2229" w:type="dxa"/>
             <w:vAlign w:val="center"/>
-            <w:hideMark/>
           </w:tcPr>
           <w:p>
             <w:pPr>
@@ -2322,43 +1496,12 @@
                 <w:szCs w:val="20"/>
               </w:rPr>
             </w:pPr>
-            <w:r>
-              <w:rPr>
-                <w:b/>
-                <w:bCs/>
-                <w:sz w:val="20"/>
-                <w:szCs w:val="20"/>
-                <w:lang w:val="en-GB"/>
-              </w:rPr>
-              <w:t>R</w:t>
-            </w:r>
-            <w:r>
-              <w:rPr>
-                <w:b/>
-                <w:bCs/>
-                <w:sz w:val="20"/>
-                <w:szCs w:val="20"/>
-                <w:lang w:val="en-GB"/>
-              </w:rPr>
-              <w:t xml:space="preserve"> </w:t>
-            </w:r>
-            <w:r>
-              <w:rPr>
-                <w:b/>
-                <w:bCs/>
-                <w:sz w:val="20"/>
-                <w:szCs w:val="20"/>
-                <w:lang w:val="en-GB"/>
-              </w:rPr>
-              <w:t>Markdown</w:t>
-            </w:r>
           </w:p>
         </w:tc>
         <w:tc>
           <w:tcPr>
             <w:tcW w:w="6083" w:type="dxa"/>
             <w:vAlign w:val="center"/>
-            <w:hideMark/>
           </w:tcPr>
           <w:p>
             <w:pPr>
@@ -2368,104 +1511,12 @@
                 <w:lang w:val="en-GB"/>
               </w:rPr>
             </w:pPr>
-            <w:r>
-              <w:rPr>
-                <w:sz w:val="20"/>
-                <w:szCs w:val="20"/>
-                <w:lang w:val="en-GB"/>
-              </w:rPr>
-              <w:t xml:space="preserve">Bonus 0.5 points if submitting an </w:t>
-            </w:r>
-            <w:proofErr w:type="spellStart"/>
-            <w:r>
-              <w:rPr>
-                <w:sz w:val="20"/>
-                <w:szCs w:val="20"/>
-                <w:lang w:val="en-GB"/>
-              </w:rPr>
-              <w:t>Rmd</w:t>
-            </w:r>
-            <w:proofErr w:type="spellEnd"/>
-            <w:r>
-              <w:rPr>
-                <w:sz w:val="20"/>
-                <w:szCs w:val="20"/>
-                <w:lang w:val="en-GB"/>
-              </w:rPr>
-              <w:t xml:space="preserve"> file that compiles </w:t>
-            </w:r>
-            <w:r>
-              <w:rPr>
-                <w:sz w:val="20"/>
-                <w:szCs w:val="20"/>
-                <w:lang w:val="en-GB"/>
-              </w:rPr>
-              <w:br/>
-              <w:t>without error</w:t>
-            </w:r>
-            <w:r>
-              <w:rPr>
-                <w:sz w:val="20"/>
-                <w:szCs w:val="20"/>
-                <w:lang w:val="en-GB"/>
-              </w:rPr>
-              <w:t xml:space="preserve">. </w:t>
-            </w:r>
-            <w:r>
-              <w:rPr>
-                <w:sz w:val="20"/>
-                <w:szCs w:val="20"/>
-                <w:lang w:val="en-GB"/>
-              </w:rPr>
-              <w:t xml:space="preserve">The </w:t>
-            </w:r>
-            <w:r>
-              <w:rPr>
-                <w:sz w:val="20"/>
-                <w:szCs w:val="20"/>
-                <w:lang w:val="en-GB"/>
-              </w:rPr>
-              <w:t>bonus</w:t>
-            </w:r>
-            <w:r>
-              <w:rPr>
-                <w:sz w:val="20"/>
-                <w:szCs w:val="20"/>
-                <w:lang w:val="en-GB"/>
-              </w:rPr>
-              <w:t xml:space="preserve"> cannot make the total </w:t>
-            </w:r>
-            <w:r>
-              <w:rPr>
-                <w:sz w:val="20"/>
-                <w:szCs w:val="20"/>
-                <w:lang w:val="en-GB"/>
-              </w:rPr>
-              <w:t>surpass</w:t>
-            </w:r>
-            <w:r>
-              <w:rPr>
-                <w:sz w:val="20"/>
-                <w:szCs w:val="20"/>
-                <w:lang w:val="en-GB"/>
-              </w:rPr>
-              <w:t xml:space="preserve"> 10</w:t>
-            </w:r>
-            <w:r>
-              <w:rPr>
-                <w:sz w:val="20"/>
-                <w:szCs w:val="20"/>
-                <w:lang w:val="en-GB"/>
-              </w:rPr>
-              <w:t xml:space="preserve"> points.</w:t>
-            </w:r>
           </w:p>
         </w:tc>
         <w:tc>
           <w:tcPr>
             <w:tcW w:w="812" w:type="dxa"/>
             <w:vAlign w:val="center"/>
-            <w:hideMark/>
           </w:tcPr>
           <w:p>
             <w:pPr>
@@ -2475,13 +1526,6 @@
                 <w:szCs w:val="20"/>
               </w:rPr>
             </w:pPr>
-            <w:r>
-              <w:rPr>
-                <w:sz w:val="20"/>
-                <w:szCs w:val="20"/>
-              </w:rPr>
-              <w:t>+0.5</w:t>
-            </w:r>
           </w:p>
         </w:tc>
       </w:tr>
@@ -8424,16 +7468,16 @@
 </file>
 
 <file path=customXml/item1.xml><?xml version="1.0" encoding="utf-8"?>
+<b:Sources xmlns:b="http://schemas.openxmlformats.org/officeDocument/2006/bibliography" xmlns="http://schemas.openxmlformats.org/officeDocument/2006/bibliography" SelectedStyle="\APASixthEditionOfficeOnline.xsl" StyleName="APA" Version="6"/>
+</file>
+
+<file path=customXml/item2.xml><?xml version="1.0" encoding="utf-8"?>
 <?mso-contentType ?>
 <FormTemplates xmlns="http://schemas.microsoft.com/sharepoint/v3/contenttype/forms">
   <Display>DocumentLibraryForm</Display>
   <Edit>DocumentLibraryForm</Edit>
   <New>DocumentLibraryForm</New>
 </FormTemplates>
-</file>
-
-<file path=customXml/item2.xml><?xml version="1.0" encoding="utf-8"?>
-<b:Sources xmlns:b="http://schemas.openxmlformats.org/officeDocument/2006/bibliography" xmlns="http://schemas.openxmlformats.org/officeDocument/2006/bibliography" SelectedStyle="\APASixthEditionOfficeOnline.xsl" StyleName="APA" Version="6"/>
 </file>
 
 <file path=customXml/item3.xml><?xml version="1.0" encoding="utf-8"?>
@@ -8660,17 +7704,17 @@
 </file>
 
 <file path=customXml/itemProps1.xml><?xml version="1.0" encoding="utf-8"?>
-<ds:datastoreItem xmlns:ds="http://schemas.openxmlformats.org/officeDocument/2006/customXml" ds:itemID="{BE56040F-5A4D-453F-A494-00ECCD7C3386}">
+<ds:datastoreItem xmlns:ds="http://schemas.openxmlformats.org/officeDocument/2006/customXml" ds:itemID="{D22F0133-C144-42F7-B3F6-C2A1492A69C5}">
   <ds:schemaRefs>
-    <ds:schemaRef ds:uri="http://schemas.microsoft.com/sharepoint/v3/contenttype/forms"/>
+    <ds:schemaRef ds:uri="http://schemas.openxmlformats.org/officeDocument/2006/bibliography"/>
   </ds:schemaRefs>
 </ds:datastoreItem>
 </file>
 
 <file path=customXml/itemProps2.xml><?xml version="1.0" encoding="utf-8"?>
-<ds:datastoreItem xmlns:ds="http://schemas.openxmlformats.org/officeDocument/2006/customXml" ds:itemID="{D22F0133-C144-42F7-B3F6-C2A1492A69C5}">
+<ds:datastoreItem xmlns:ds="http://schemas.openxmlformats.org/officeDocument/2006/customXml" ds:itemID="{BE56040F-5A4D-453F-A494-00ECCD7C3386}">
   <ds:schemaRefs>
-    <ds:schemaRef ds:uri="http://schemas.openxmlformats.org/officeDocument/2006/bibliography"/>
+    <ds:schemaRef ds:uri="http://schemas.microsoft.com/sharepoint/v3/contenttype/forms"/>
   </ds:schemaRefs>
 </ds:datastoreItem>
 </file>

</xml_diff>

<commit_message>
Activate 2026-27 paper exposition project
</commit_message>
<xml_diff>
--- a/10_RUBRICS/G351-QMH-Rubric-Project.docx
+++ b/10_RUBRICS/G351-QMH-Rubric-Project.docx
@@ -1,709 +1,330 @@
 
 <file path=word/document.xml><?xml version="1.0" encoding="utf-8"?>
-<w:document xmlns:wpc="http://schemas.microsoft.com/office/word/2010/wordprocessingCanvas" xmlns:cx="http://schemas.microsoft.com/office/drawing/2014/chartex" xmlns:cx1="http://schemas.microsoft.com/office/drawing/2015/9/8/chartex" xmlns:cx2="http://schemas.microsoft.com/office/drawing/2015/10/21/chartex" xmlns:cx3="http://schemas.microsoft.com/office/drawing/2016/5/9/chartex" xmlns:cx4="http://schemas.microsoft.com/office/drawing/2016/5/10/chartex" xmlns:cx5="http://schemas.microsoft.com/office/drawing/2016/5/11/chartex" xmlns:cx6="http://schemas.microsoft.com/office/drawing/2016/5/12/chartex" xmlns:cx7="http://schemas.microsoft.com/office/drawing/2016/5/13/chartex" xmlns:cx8="http://schemas.microsoft.com/office/drawing/2016/5/14/chartex" xmlns:mc="http://schemas.openxmlformats.org/markup-compatibility/2006" xmlns:aink="http://schemas.microsoft.com/office/drawing/2016/ink" xmlns:am3d="http://schemas.microsoft.com/office/drawing/2017/model3d" xmlns:o="urn:schemas-microsoft-com:office:office" xmlns:oel="http://schemas.microsoft.com/office/2019/extlst" xmlns:r="http://schemas.openxmlformats.org/officeDocument/2006/relationships" xmlns:m="http://schemas.openxmlformats.org/officeDocument/2006/math" xmlns:v="urn:schemas-microsoft-com:vml" xmlns:wp14="http://schemas.microsoft.com/office/word/2010/wordprocessingDrawing" xmlns:wp="http://schemas.openxmlformats.org/drawingml/2006/wordprocessingDrawing" xmlns:w10="urn:schemas-microsoft-com:office:word" xmlns:w="http://schemas.openxmlformats.org/wordprocessingml/2006/main" xmlns:w14="http://schemas.microsoft.com/office/word/2010/wordml" xmlns:w15="http://schemas.microsoft.com/office/word/2012/wordml" xmlns:w16cex="http://schemas.microsoft.com/office/word/2018/wordml/cex" xmlns:w16cid="http://schemas.microsoft.com/office/word/2016/wordml/cid" xmlns:w16="http://schemas.microsoft.com/office/word/2018/wordml" xmlns:w16du="http://schemas.microsoft.com/office/word/2023/wordml/word16du" xmlns:w16sdtdh="http://schemas.microsoft.com/office/word/2020/wordml/sdtdatahash" xmlns:w16sdtfl="http://schemas.microsoft.com/office/word/2024/wordml/sdtformatlock" xmlns:w16se="http://schemas.microsoft.com/office/word/2015/wordml/symex" xmlns:wpg="http://schemas.microsoft.com/office/word/2010/wordprocessingGroup" xmlns:wpi="http://schemas.microsoft.com/office/word/2010/wordprocessingInk" xmlns:wne="http://schemas.microsoft.com/office/word/2006/wordml" xmlns:wps="http://schemas.microsoft.com/office/word/2010/wordprocessingShape" mc:Ignorable="w14 w15 w16se w16cid w16 w16cex w16sdtdh w16sdtfl w16du wp14">
+<w:document xmlns:wpc="http://schemas.microsoft.com/office/word/2010/wordprocessingCanvas" xmlns:mc="http://schemas.openxmlformats.org/markup-compatibility/2006" xmlns:o="urn:schemas-microsoft-com:office:office" xmlns:r="http://schemas.openxmlformats.org/officeDocument/2006/relationships" xmlns:m="http://schemas.openxmlformats.org/officeDocument/2006/math" xmlns:v="urn:schemas-microsoft-com:vml" xmlns:wp14="http://schemas.microsoft.com/office/word/2010/wordprocessingDrawing" xmlns:wp="http://schemas.openxmlformats.org/drawingml/2006/wordprocessingDrawing" xmlns:w10="urn:schemas-microsoft-com:office:word" xmlns:w="http://schemas.openxmlformats.org/wordprocessingml/2006/main" xmlns:w14="http://schemas.microsoft.com/office/word/2010/wordml" xmlns:w15="http://schemas.microsoft.com/office/word/2012/wordml" xmlns:wpg="http://schemas.microsoft.com/office/word/2010/wordprocessingGroup" xmlns:wpi="http://schemas.microsoft.com/office/word/2010/wordprocessingInk" xmlns:wne="http://schemas.microsoft.com/office/word/2006/wordml" xmlns:wps="http://schemas.microsoft.com/office/word/2010/wordprocessingShape" mc:Ignorable="w14 w15 wp14">
   <w:body>
+    <w:p>
+      <w:pPr>
+        <w:pStyle w:val="Title"/>
+      </w:pPr>
+      <w:r>
+        <w:t xml:space="preserve">Rubric for Project: Causal Inference Paper Exposition</w:t>
+      </w:r>
+    </w:p>
+    <w:p>
+      <w:r>
+        <w:t xml:space="preserve">Quantitative Methods for Humanities (G351)</w:t>
+      </w:r>
+    </w:p>
+    <w:p>
+      <w:r>
+        <w:t xml:space="preserve">Academic year: 2026-27</w:t>
+      </w:r>
+    </w:p>
+    <w:p>
+      <w:r>
+        <w:t xml:space="preserve">Evaluation: Group Project</w:t>
+      </w:r>
+    </w:p>
+    <w:p>
+      <w:r>
+        <w:t xml:space="preserve">Weight: 10% of the final grade</w:t>
+      </w:r>
+    </w:p>
+    <w:p>
+      <w:r>
+        <w:t xml:space="preserve">Coordinator: Abel Guada Azze (abel.guada@cunef.edu)</w:t>
+      </w:r>
+    </w:p>
+    <w:p>
+      <w:pPr>
+        <w:pStyle w:val="Heading1"/>
+      </w:pPr>
+      <w:r>
+        <w:t xml:space="preserve">Description and Content</w:t>
+      </w:r>
+    </w:p>
+    <w:p>
+      <w:r>
+        <w:t xml:space="preserve">This project evaluates each group's ability to read, understand, and explain a published paper that uses causal inference. The grade is based on the short report, the presentation slides, the oral presentation, and the answers given during the question period. Students are not required to conduct a new data analysis or submit code.</w:t>
+      </w:r>
+    </w:p>
+    <w:p>
+      <w:pPr>
+        <w:pStyle w:val="Heading1"/>
+      </w:pPr>
+      <w:r>
+        <w:t xml:space="preserve">Points and Weights</w:t>
+      </w:r>
+    </w:p>
+    <w:p>
+      <w:r>
+        <w:t xml:space="preserve">The project is graded on a 10-point scale using the following criteria.</w:t>
+      </w:r>
+    </w:p>
     <w:tbl>
       <w:tblPr>
-        <w:tblStyle w:val="TableGrid"/>
-        <w:tblpPr w:leftFromText="180" w:rightFromText="180" w:horzAnchor="page" w:tblpXSpec="center" w:tblpY="449"/>
-        <w:tblW w:w="10348" w:type="dxa"/>
-        <w:tblLayout w:type="fixed"/>
-        <w:tblLook w:val="04A0" w:firstRow="1" w:lastRow="0" w:firstColumn="1" w:lastColumn="0" w:noHBand="0" w:noVBand="1"/>
+        <w:tblW w:w="9360" w:type="dxa"/>
+        <w:tblBorders>
+          <w:top w:val="single" w:sz="4" w:space="0" w:color="999999"/>
+          <w:left w:val="single" w:sz="4" w:space="0" w:color="999999"/>
+          <w:bottom w:val="single" w:sz="4" w:space="0" w:color="999999"/>
+          <w:right w:val="single" w:sz="4" w:space="0" w:color="999999"/>
+          <w:insideH w:val="single" w:sz="4" w:space="0" w:color="CCCCCC"/>
+          <w:insideV w:val="single" w:sz="4" w:space="0" w:color="CCCCCC"/>
+        </w:tblBorders>
       </w:tblPr>
       <w:tblGrid>
-        <w:gridCol w:w="1843"/>
-        <w:gridCol w:w="1985"/>
-        <w:gridCol w:w="1701"/>
-        <w:gridCol w:w="4819"/>
+        <w:gridCol w:w="3000"/>
+        <w:gridCol w:w="1000"/>
+        <w:gridCol w:w="5360"/>
       </w:tblGrid>
       <w:tr>
-        <w:trPr>
-          <w:cnfStyle w:val="100000000000" w:firstRow="1" w:lastRow="0" w:firstColumn="0" w:lastColumn="0" w:oddVBand="0" w:evenVBand="0" w:oddHBand="0" w:evenHBand="0" w:firstRowFirstColumn="0" w:firstRowLastColumn="0" w:lastRowFirstColumn="0" w:lastRowLastColumn="0"/>
-          <w:trHeight w:val="80"/>
-        </w:trPr>
         <w:tc>
           <w:tcPr>
-            <w:tcW w:w="1843" w:type="dxa"/>
-            <w:tcBorders>
-              <w:top w:val="none" w:sz="0" w:space="0" w:color="auto"/>
-              <w:left w:val="none" w:sz="0" w:space="0" w:color="auto"/>
-              <w:bottom w:val="none" w:sz="0" w:space="0" w:color="auto"/>
-              <w:right w:val="none" w:sz="0" w:space="0" w:color="auto"/>
-              <w:tl2br w:val="none" w:sz="0" w:space="0" w:color="auto"/>
-              <w:tr2bl w:val="none" w:sz="0" w:space="0" w:color="auto"/>
-            </w:tcBorders>
-            <w:vAlign w:val="center"/>
+            <w:tcW w:w="3000" w:type="dxa"/>
           </w:tcPr>
           <w:p>
-            <w:pPr>
-              <w:jc w:val="right"/>
-              <w:rPr>
-                <w:rFonts w:cstheme="minorHAnsi"/>
-                <w:b/>
-                <w:bCs/>
-                <w:color w:val="EC7301"/>
-                <w:lang w:val="en-US"/>
-              </w:rPr>
-            </w:pPr>
             <w:r>
               <w:rPr>
-                <w:rFonts w:cstheme="minorHAnsi"/>
                 <w:b/>
-                <w:bCs/>
-                <w:smallCaps/>
-                <w:color w:val="FF5700"/>
-                <w:lang w:val="en-US"/>
               </w:rPr>
-              <w:t>Course</w:t>
-            </w:r>
-            <w:r>
-              <w:rPr>
-                <w:rFonts w:cstheme="minorHAnsi"/>
-                <w:b/>
-                <w:bCs/>
-                <w:color w:val="EC7301"/>
-                <w:lang w:val="en-US"/>
-              </w:rPr>
-              <w:t>:</w:t>
+              <w:t xml:space="preserve">Criterion</w:t>
             </w:r>
           </w:p>
         </w:tc>
         <w:tc>
           <w:tcPr>
-            <w:tcW w:w="1985" w:type="dxa"/>
-            <w:tcBorders>
-              <w:top w:val="none" w:sz="0" w:space="0" w:color="auto"/>
-              <w:left w:val="none" w:sz="0" w:space="0" w:color="auto"/>
-              <w:bottom w:val="none" w:sz="0" w:space="0" w:color="auto"/>
-              <w:right w:val="none" w:sz="0" w:space="0" w:color="auto"/>
-              <w:tl2br w:val="none" w:sz="0" w:space="0" w:color="auto"/>
-              <w:tr2bl w:val="none" w:sz="0" w:space="0" w:color="auto"/>
-            </w:tcBorders>
-            <w:vAlign w:val="center"/>
+            <w:tcW w:w="1000" w:type="dxa"/>
           </w:tcPr>
           <w:p>
-            <w:pPr>
-              <w:rPr>
-                <w:rFonts w:cstheme="minorHAnsi"/>
-                <w:lang w:val="en-US"/>
-              </w:rPr>
-            </w:pPr>
-            <w:proofErr w:type="spellStart"/>
             <w:r>
               <w:rPr>
-                <w:rFonts w:cstheme="minorHAnsi"/>
-                <w:color w:val="000000"/>
-                <w:shd w:val="clear" w:color="auto" w:fill="FFFFFF"/>
+                <w:b/>
               </w:rPr>
-              <w:t>Quantitative</w:t>
-            </w:r>
-            <w:proofErr w:type="spellEnd"/>
-            <w:r>
-              <w:rPr>
-                <w:rFonts w:cstheme="minorHAnsi"/>
-                <w:color w:val="000000"/>
-                <w:shd w:val="clear" w:color="auto" w:fill="FFFFFF"/>
-              </w:rPr>
-              <w:t xml:space="preserve"> </w:t>
-            </w:r>
-            <w:proofErr w:type="spellStart"/>
-            <w:r>
-              <w:rPr>
-                <w:rFonts w:cstheme="minorHAnsi"/>
-                <w:color w:val="000000"/>
-                <w:shd w:val="clear" w:color="auto" w:fill="FFFFFF"/>
-              </w:rPr>
-              <w:t>Methods</w:t>
-            </w:r>
-            <w:proofErr w:type="spellEnd"/>
-            <w:r>
-              <w:rPr>
-                <w:rFonts w:cstheme="minorHAnsi"/>
-                <w:color w:val="000000"/>
-                <w:shd w:val="clear" w:color="auto" w:fill="FFFFFF"/>
-              </w:rPr>
-              <w:t xml:space="preserve"> </w:t>
-            </w:r>
-            <w:proofErr w:type="spellStart"/>
-            <w:r>
-              <w:rPr>
-                <w:rFonts w:cstheme="minorHAnsi"/>
-                <w:color w:val="000000"/>
-                <w:shd w:val="clear" w:color="auto" w:fill="FFFFFF"/>
-              </w:rPr>
-              <w:t>for</w:t>
-            </w:r>
-            <w:proofErr w:type="spellEnd"/>
-            <w:r>
-              <w:rPr>
-                <w:rFonts w:cstheme="minorHAnsi"/>
-                <w:color w:val="000000"/>
-                <w:shd w:val="clear" w:color="auto" w:fill="FFFFFF"/>
-              </w:rPr>
-              <w:t xml:space="preserve"> </w:t>
-            </w:r>
-            <w:proofErr w:type="spellStart"/>
-            <w:r>
-              <w:rPr>
-                <w:rFonts w:cstheme="minorHAnsi"/>
-                <w:color w:val="000000"/>
-                <w:shd w:val="clear" w:color="auto" w:fill="FFFFFF"/>
-              </w:rPr>
-              <w:t>Humanities</w:t>
-            </w:r>
-            <w:proofErr w:type="spellEnd"/>
-          </w:p>
-        </w:tc>
-        <w:tc>
-          <w:tcPr>
-            <w:tcW w:w="1701" w:type="dxa"/>
-            <w:tcBorders>
-              <w:top w:val="none" w:sz="0" w:space="0" w:color="auto"/>
-              <w:left w:val="none" w:sz="0" w:space="0" w:color="auto"/>
-              <w:bottom w:val="none" w:sz="0" w:space="0" w:color="auto"/>
-              <w:right w:val="none" w:sz="0" w:space="0" w:color="auto"/>
-              <w:tl2br w:val="none" w:sz="0" w:space="0" w:color="auto"/>
-              <w:tr2bl w:val="none" w:sz="0" w:space="0" w:color="auto"/>
-            </w:tcBorders>
-            <w:vAlign w:val="center"/>
-          </w:tcPr>
-          <w:p>
-            <w:pPr>
-              <w:jc w:val="right"/>
-              <w:rPr>
-                <w:rFonts w:cstheme="minorHAnsi"/>
-                <w:b/>
-                <w:bCs/>
-                <w:color w:val="EC7301"/>
-                <w:lang w:val="en-US"/>
-              </w:rPr>
-            </w:pPr>
-            <w:r>
-              <w:rPr>
-                <w:rFonts w:cstheme="minorHAnsi"/>
-                <w:b/>
-                <w:bCs/>
-                <w:smallCaps/>
-                <w:color w:val="FF5700"/>
-                <w:lang w:val="en-US"/>
-              </w:rPr>
-              <w:t>C</w:t>
-            </w:r>
-            <w:r>
-              <w:rPr>
-                <w:rFonts w:cstheme="minorHAnsi"/>
-                <w:b/>
-                <w:bCs/>
-                <w:smallCaps/>
-                <w:color w:val="FF5700"/>
-                <w:lang w:val="en-US"/>
-              </w:rPr>
-              <w:t>ode</w:t>
-            </w:r>
-            <w:r>
-              <w:rPr>
-                <w:rFonts w:cstheme="minorHAnsi"/>
-                <w:b/>
-                <w:bCs/>
-                <w:smallCaps/>
-                <w:color w:val="EC7301"/>
-                <w:lang w:val="en-US"/>
-              </w:rPr>
-              <w:t>:</w:t>
+              <w:t xml:space="preserve">Points</w:t>
             </w:r>
           </w:p>
         </w:tc>
         <w:tc>
           <w:tcPr>
-            <w:tcW w:w="4819" w:type="dxa"/>
-            <w:tcBorders>
-              <w:top w:val="none" w:sz="0" w:space="0" w:color="auto"/>
-              <w:left w:val="none" w:sz="0" w:space="0" w:color="auto"/>
-              <w:bottom w:val="none" w:sz="0" w:space="0" w:color="auto"/>
-              <w:right w:val="none" w:sz="0" w:space="0" w:color="auto"/>
-              <w:tl2br w:val="none" w:sz="0" w:space="0" w:color="auto"/>
-              <w:tr2bl w:val="none" w:sz="0" w:space="0" w:color="auto"/>
-            </w:tcBorders>
-            <w:vAlign w:val="center"/>
+            <w:tcW w:w="5360" w:type="dxa"/>
           </w:tcPr>
           <w:p>
-            <w:pPr>
-              <w:rPr>
-                <w:rFonts w:cstheme="minorHAnsi"/>
-                <w:smallCaps/>
-                <w:color w:val="FF5700"/>
-                <w:lang w:val="en-US"/>
-              </w:rPr>
-            </w:pPr>
             <w:r>
               <w:rPr>
-                <w:rFonts w:cstheme="minorHAnsi"/>
-                <w:smallCaps/>
-                <w:color w:val="000000" w:themeColor="text1"/>
-                <w:lang w:val="en-US"/>
+                <w:b/>
               </w:rPr>
-              <w:t>G3</w:t>
-            </w:r>
-            <w:r>
-              <w:rPr>
-                <w:rFonts w:cstheme="minorHAnsi"/>
-                <w:smallCaps/>
-                <w:color w:val="000000" w:themeColor="text1"/>
-                <w:lang w:val="en-US"/>
-              </w:rPr>
-              <w:t>51</w:t>
+              <w:t xml:space="preserve">What is evaluated</w:t>
             </w:r>
           </w:p>
         </w:tc>
       </w:tr>
       <w:tr>
-        <w:trPr>
-          <w:trHeight w:val="150"/>
-        </w:trPr>
         <w:tc>
           <w:tcPr>
-            <w:tcW w:w="1843" w:type="dxa"/>
-            <w:vAlign w:val="center"/>
+            <w:tcW w:w="3000" w:type="dxa"/>
           </w:tcPr>
           <w:p>
-            <w:pPr>
-              <w:jc w:val="right"/>
-              <w:rPr>
-                <w:rFonts w:cstheme="minorHAnsi"/>
-                <w:b/>
-                <w:bCs/>
-                <w:smallCaps/>
-                <w:color w:val="EC7301"/>
-                <w:lang w:val="en-US"/>
-              </w:rPr>
-            </w:pPr>
             <w:r>
-              <w:rPr>
-                <w:rFonts w:cstheme="minorHAnsi"/>
-                <w:b/>
-                <w:bCs/>
-                <w:smallCaps/>
-                <w:color w:val="FF5700"/>
-                <w:lang w:val="en-US"/>
-              </w:rPr>
-              <w:t>Year</w:t>
-            </w:r>
-            <w:r>
-              <w:rPr>
-                <w:rFonts w:cstheme="minorHAnsi"/>
-                <w:b/>
-                <w:bCs/>
-                <w:smallCaps/>
-                <w:color w:val="EC7301"/>
-                <w:lang w:val="en-US"/>
-              </w:rPr>
-              <w:t>:</w:t>
+              <w:rPr/>
+              <w:t xml:space="preserve">Problem, research question, and motivation</w:t>
             </w:r>
           </w:p>
         </w:tc>
         <w:tc>
           <w:tcPr>
-            <w:tcW w:w="1985" w:type="dxa"/>
-            <w:vAlign w:val="center"/>
+            <w:tcW w:w="1000" w:type="dxa"/>
           </w:tcPr>
           <w:p>
-            <w:pPr>
-              <w:rPr>
-                <w:rFonts w:cstheme="minorHAnsi"/>
-                <w:lang w:val="en-US"/>
-              </w:rPr>
-            </w:pPr>
             <w:r>
-              <w:rPr>
-                <w:rFonts w:cstheme="minorHAnsi"/>
-                <w:lang w:val="en-US"/>
-              </w:rPr>
-              <w:t>2</w:t>
+              <w:rPr/>
+              <w:t xml:space="preserve">1.5</w:t>
             </w:r>
           </w:p>
         </w:tc>
         <w:tc>
           <w:tcPr>
-            <w:tcW w:w="1701" w:type="dxa"/>
-            <w:vAlign w:val="center"/>
+            <w:tcW w:w="5360" w:type="dxa"/>
           </w:tcPr>
           <w:p>
-            <w:pPr>
-              <w:jc w:val="right"/>
-              <w:rPr>
-                <w:rFonts w:cstheme="minorHAnsi"/>
-                <w:b/>
-                <w:bCs/>
-                <w:smallCaps/>
-                <w:color w:val="EC7301"/>
-                <w:lang w:val="en-US"/>
-              </w:rPr>
-            </w:pPr>
             <w:r>
-              <w:rPr>
-                <w:rFonts w:cstheme="minorHAnsi"/>
-                <w:b/>
-                <w:bCs/>
-                <w:smallCaps/>
-                <w:color w:val="FF5700"/>
-                <w:lang w:val="en-US"/>
-              </w:rPr>
-              <w:t>S</w:t>
+              <w:rPr/>
+              <w:t xml:space="preserve">The paper, problem, motivation, research question, and main claim are explained clearly and in the group's own words.</w:t>
             </w:r>
+          </w:p>
+        </w:tc>
+      </w:tr>
+      <w:tr>
+        <w:tc>
+          <w:tcPr>
+            <w:tcW w:w="3000" w:type="dxa"/>
+          </w:tcPr>
+          <w:p>
             <w:r>
-              <w:rPr>
-                <w:rFonts w:cstheme="minorHAnsi"/>
-                <w:b/>
-                <w:bCs/>
-                <w:smallCaps/>
-                <w:color w:val="FF5700"/>
-                <w:lang w:val="en-US"/>
-              </w:rPr>
-              <w:t>emester</w:t>
-            </w:r>
-            <w:r>
-              <w:rPr>
-                <w:rFonts w:cstheme="minorHAnsi"/>
-                <w:b/>
-                <w:bCs/>
-                <w:smallCaps/>
-                <w:color w:val="EC7301"/>
-                <w:lang w:val="en-US"/>
-              </w:rPr>
-              <w:t>:</w:t>
+              <w:rPr/>
+              <w:t xml:space="preserve">Causal framework</w:t>
             </w:r>
           </w:p>
         </w:tc>
         <w:tc>
           <w:tcPr>
-            <w:tcW w:w="4819" w:type="dxa"/>
-            <w:vAlign w:val="center"/>
+            <w:tcW w:w="1000" w:type="dxa"/>
           </w:tcPr>
           <w:p>
-            <w:pPr>
-              <w:rPr>
-                <w:rFonts w:cstheme="minorHAnsi"/>
-                <w:lang w:val="en-US"/>
-              </w:rPr>
-            </w:pPr>
             <w:r>
-              <w:rPr>
-                <w:rFonts w:cstheme="minorHAnsi"/>
-                <w:lang w:val="en-US"/>
-              </w:rPr>
-              <w:t>2</w:t>
+              <w:rPr/>
+              <w:t xml:space="preserve">2.0</w:t>
+            </w:r>
+          </w:p>
+        </w:tc>
+        <w:tc>
+          <w:tcPr>
+            <w:tcW w:w="5360" w:type="dxa"/>
+          </w:tcPr>
+          <w:p>
+            <w:r>
+              <w:rPr/>
+              <w:t xml:space="preserve">The group correctly identifies the unit of analysis, treatment or exposure, outcome, comparison group, estimand when available, and counterfactual logic.</w:t>
             </w:r>
           </w:p>
         </w:tc>
       </w:tr>
       <w:tr>
-        <w:trPr>
-          <w:trHeight w:val="150"/>
-        </w:trPr>
         <w:tc>
           <w:tcPr>
-            <w:tcW w:w="1843" w:type="dxa"/>
-            <w:vAlign w:val="center"/>
+            <w:tcW w:w="3000" w:type="dxa"/>
           </w:tcPr>
           <w:p>
-            <w:pPr>
-              <w:jc w:val="right"/>
-              <w:rPr>
-                <w:rFonts w:cstheme="minorHAnsi"/>
-                <w:b/>
-                <w:bCs/>
-                <w:smallCaps/>
-                <w:color w:val="FF5700"/>
-                <w:lang w:val="en-US"/>
-              </w:rPr>
-            </w:pPr>
-            <w:proofErr w:type="gramStart"/>
             <w:r>
-              <w:rPr>
-                <w:rFonts w:cstheme="minorHAnsi"/>
-                <w:b/>
-                <w:bCs/>
-                <w:smallCaps/>
-                <w:color w:val="FF5700"/>
-                <w:lang w:val="en-US"/>
-              </w:rPr>
-              <w:t>Evaluation</w:t>
-            </w:r>
-            <w:proofErr w:type="gramEnd"/>
-            <w:r>
-              <w:rPr>
-                <w:rFonts w:cstheme="minorHAnsi"/>
-                <w:b/>
-                <w:bCs/>
-                <w:smallCaps/>
-                <w:color w:val="FF5700"/>
-                <w:lang w:val="en-US"/>
-              </w:rPr>
-              <w:t>:</w:t>
+              <w:rPr/>
+              <w:t xml:space="preserve">Data and descriptive evidence</w:t>
             </w:r>
           </w:p>
         </w:tc>
         <w:tc>
           <w:tcPr>
-            <w:tcW w:w="1985" w:type="dxa"/>
-            <w:vAlign w:val="center"/>
+            <w:tcW w:w="1000" w:type="dxa"/>
           </w:tcPr>
           <w:p>
-            <w:pPr>
-              <w:rPr>
-                <w:rFonts w:cstheme="minorHAnsi"/>
-                <w:lang w:val="en-US"/>
-              </w:rPr>
-            </w:pPr>
             <w:r>
-              <w:rPr>
-                <w:rFonts w:cstheme="minorHAnsi"/>
-                <w:lang w:val="en-US"/>
-              </w:rPr>
-              <w:t>Project</w:t>
+              <w:rPr/>
+              <w:t xml:space="preserve">1.5</w:t>
             </w:r>
           </w:p>
         </w:tc>
         <w:tc>
           <w:tcPr>
-            <w:tcW w:w="1701" w:type="dxa"/>
-            <w:vAlign w:val="center"/>
+            <w:tcW w:w="5360" w:type="dxa"/>
           </w:tcPr>
           <w:p>
-            <w:pPr>
-              <w:jc w:val="right"/>
-              <w:rPr>
-                <w:rFonts w:cstheme="minorHAnsi"/>
-                <w:b/>
-                <w:bCs/>
-                <w:smallCaps/>
-                <w:color w:val="FF5700"/>
-                <w:lang w:val="en-US"/>
-              </w:rPr>
-            </w:pPr>
             <w:r>
-              <w:rPr>
-                <w:rFonts w:cstheme="minorHAnsi"/>
-                <w:b/>
-                <w:bCs/>
-                <w:smallCaps/>
-                <w:color w:val="FF5700"/>
-                <w:lang w:val="en-US"/>
-              </w:rPr>
-              <w:t>Coordinator:</w:t>
+              <w:rPr/>
+              <w:t xml:space="preserve">The data source, sample, time period, key variables, and relevant descriptive table or figure are explained accurately.</w:t>
+            </w:r>
+          </w:p>
+        </w:tc>
+      </w:tr>
+      <w:tr>
+        <w:tc>
+          <w:tcPr>
+            <w:tcW w:w="3000" w:type="dxa"/>
+          </w:tcPr>
+          <w:p>
+            <w:r>
+              <w:rPr/>
+              <w:t xml:space="preserve">Causal method, assumptions, and threats</w:t>
             </w:r>
           </w:p>
         </w:tc>
         <w:tc>
           <w:tcPr>
-            <w:tcW w:w="4819" w:type="dxa"/>
-            <w:vAlign w:val="center"/>
+            <w:tcW w:w="1000" w:type="dxa"/>
           </w:tcPr>
           <w:p>
-            <w:pPr>
-              <w:rPr>
-                <w:rFonts w:cstheme="minorHAnsi"/>
-              </w:rPr>
-            </w:pPr>
             <w:r>
-              <w:rPr>
-                <w:rFonts w:cstheme="minorHAnsi"/>
-              </w:rPr>
-              <w:t xml:space="preserve">Abel Guada </w:t>
+              <w:rPr/>
+              <w:t xml:space="preserve">2.0</w:t>
             </w:r>
+          </w:p>
+        </w:tc>
+        <w:tc>
+          <w:tcPr>
+            <w:tcW w:w="5360" w:type="dxa"/>
+          </w:tcPr>
+          <w:p>
             <w:r>
-              <w:rPr>
-                <w:rFonts w:cstheme="minorHAnsi"/>
-              </w:rPr>
-              <w:t>A</w:t>
-            </w:r>
-            <w:r>
-              <w:rPr>
-                <w:rFonts w:cstheme="minorHAnsi"/>
-              </w:rPr>
-              <w:t>zze</w:t>
-            </w:r>
-            <w:r>
-              <w:rPr>
-                <w:rFonts w:cstheme="minorHAnsi"/>
-              </w:rPr>
-              <w:t xml:space="preserve"> (</w:t>
-            </w:r>
-            <w:hyperlink r:id="rId10" w:history="1">
-              <w:r>
-                <w:rPr>
-                  <w:rStyle w:val="Hyperlink"/>
-                  <w:rFonts w:cstheme="minorHAnsi"/>
-                </w:rPr>
-                <w:t>abel.guada@cunef.edu</w:t>
-              </w:r>
-            </w:hyperlink>
-            <w:r>
-              <w:rPr>
-                <w:rFonts w:cstheme="minorHAnsi"/>
-              </w:rPr>
-              <w:t>)</w:t>
+              <w:rPr/>
+              <w:t xml:space="preserve">The identification strategy is explained in words, with attention to the key assumption, threats to validity, and checks or robustness exercises used by the authors.</w:t>
             </w:r>
           </w:p>
         </w:tc>
       </w:tr>
       <w:tr>
-        <w:trPr>
-          <w:trHeight w:val="150"/>
-        </w:trPr>
         <w:tc>
           <w:tcPr>
-            <w:tcW w:w="1843" w:type="dxa"/>
-            <w:vAlign w:val="center"/>
+            <w:tcW w:w="3000" w:type="dxa"/>
           </w:tcPr>
           <w:p>
-            <w:pPr>
-              <w:jc w:val="right"/>
-              <w:rPr>
-                <w:rFonts w:cstheme="minorHAnsi"/>
-                <w:b/>
-                <w:bCs/>
-                <w:smallCaps/>
-                <w:color w:val="FF5700"/>
-                <w:lang w:val="en-US"/>
-              </w:rPr>
-            </w:pPr>
             <w:r>
-              <w:rPr>
-                <w:rFonts w:cstheme="minorHAnsi"/>
-                <w:b/>
-                <w:bCs/>
-                <w:smallCaps/>
-                <w:color w:val="FF5700"/>
-                <w:lang w:val="en-US"/>
-              </w:rPr>
-              <w:t>S</w:t>
-            </w:r>
-            <w:r>
-              <w:rPr>
-                <w:rFonts w:cstheme="minorHAnsi"/>
-                <w:b/>
-                <w:bCs/>
-                <w:smallCaps/>
-                <w:color w:val="FF5700"/>
-                <w:lang w:val="en-US"/>
-              </w:rPr>
-              <w:t xml:space="preserve">ubmission </w:t>
-            </w:r>
-            <w:r>
-              <w:rPr>
-                <w:rFonts w:cstheme="minorHAnsi"/>
-                <w:b/>
-                <w:bCs/>
-                <w:smallCaps/>
-                <w:color w:val="FF5700"/>
-                <w:lang w:val="en-US"/>
-              </w:rPr>
-              <w:t>Date:</w:t>
+              <w:rPr/>
+              <w:t xml:space="preserve">Results, uncertainty, and interpretation</w:t>
             </w:r>
           </w:p>
         </w:tc>
         <w:tc>
           <w:tcPr>
-            <w:tcW w:w="1985" w:type="dxa"/>
-            <w:vAlign w:val="center"/>
+            <w:tcW w:w="1000" w:type="dxa"/>
           </w:tcPr>
           <w:p>
-            <w:pPr>
-              <w:rPr>
-                <w:rFonts w:cstheme="minorHAnsi"/>
-              </w:rPr>
-            </w:pPr>
             <w:r>
-              <w:rPr>
-                <w:rFonts w:cstheme="minorHAnsi"/>
-              </w:rPr>
-              <w:t>27</w:t>
-            </w:r>
-            <w:r>
-              <w:rPr>
-                <w:rFonts w:cstheme="minorHAnsi"/>
-              </w:rPr>
-              <w:t>/0</w:t>
-            </w:r>
-            <w:r>
-              <w:rPr>
-                <w:rFonts w:cstheme="minorHAnsi"/>
-              </w:rPr>
-              <w:t>4</w:t>
-            </w:r>
-            <w:r>
-              <w:rPr>
-                <w:rFonts w:cstheme="minorHAnsi"/>
-              </w:rPr>
-              <w:t>/202</w:t>
-            </w:r>
-            <w:r>
-              <w:rPr>
-                <w:rFonts w:cstheme="minorHAnsi"/>
-              </w:rPr>
-              <w:t>6</w:t>
+              <w:rPr/>
+              <w:t xml:space="preserve">1.5</w:t>
             </w:r>
           </w:p>
         </w:tc>
         <w:tc>
           <w:tcPr>
-            <w:tcW w:w="1701" w:type="dxa"/>
-            <w:vAlign w:val="center"/>
+            <w:tcW w:w="5360" w:type="dxa"/>
           </w:tcPr>
           <w:p>
-            <w:pPr>
-              <w:jc w:val="right"/>
-              <w:rPr>
-                <w:rFonts w:cstheme="minorHAnsi"/>
-                <w:b/>
-                <w:bCs/>
-                <w:smallCaps/>
-                <w:color w:val="FF5700"/>
-                <w:lang w:val="en-US"/>
-              </w:rPr>
-            </w:pPr>
             <w:r>
-              <w:rPr>
-                <w:rFonts w:cstheme="minorHAnsi"/>
-                <w:b/>
-                <w:bCs/>
-                <w:smallCaps/>
-                <w:color w:val="FF5700"/>
-                <w:lang w:val="en-US"/>
-              </w:rPr>
-              <w:t>Weight:</w:t>
+              <w:rPr/>
+              <w:t xml:space="preserve">The main result is interpreted in plain language, including direction, size, uncertainty when reported, and substantive meaning.</w:t>
+            </w:r>
+          </w:p>
+        </w:tc>
+      </w:tr>
+      <w:tr>
+        <w:tc>
+          <w:tcPr>
+            <w:tcW w:w="3000" w:type="dxa"/>
+          </w:tcPr>
+          <w:p>
+            <w:r>
+              <w:rPr/>
+              <w:t xml:space="preserve">Presentation, oral questions, and source use</w:t>
             </w:r>
           </w:p>
         </w:tc>
         <w:tc>
           <w:tcPr>
-            <w:tcW w:w="4819" w:type="dxa"/>
-            <w:vAlign w:val="center"/>
+            <w:tcW w:w="1000" w:type="dxa"/>
           </w:tcPr>
           <w:p>
-            <w:pPr>
-              <w:rPr>
-                <w:rFonts w:cstheme="minorHAnsi"/>
-              </w:rPr>
-            </w:pPr>
             <w:r>
-              <w:rPr>
-                <w:rFonts w:cstheme="minorHAnsi"/>
-              </w:rPr>
-              <w:t>1</w:t>
+              <w:rPr/>
+              <w:t xml:space="preserve">1.5</w:t>
             </w:r>
+          </w:p>
+        </w:tc>
+        <w:tc>
+          <w:tcPr>
+            <w:tcW w:w="5360" w:type="dxa"/>
+          </w:tcPr>
+          <w:p>
             <w:r>
-              <w:rPr>
-                <w:rFonts w:cstheme="minorHAnsi"/>
-              </w:rPr>
-              <w:t>5</w:t>
-            </w:r>
-            <w:r>
-              <w:rPr>
-                <w:rFonts w:cstheme="minorHAnsi"/>
-              </w:rPr>
-              <w:t>%</w:t>
+              <w:rPr/>
+              <w:t xml:space="preserve">Slides and report are clear and selective, members can answer basic questions about the paper, and claims are tied to specific pages, tables, figures, or results.</w:t>
             </w:r>
           </w:p>
         </w:tc>
@@ -711,1456 +332,162 @@
     </w:tbl>
     <w:p>
       <w:pPr>
-        <w:rPr>
-          <w:rFonts w:cstheme="minorHAnsi"/>
-        </w:rPr>
-      </w:pPr>
-    </w:p>
-    <w:p>
-      <w:pPr>
-        <w:pStyle w:val="ListParagraph"/>
-        <w:numPr>
-          <w:ilvl w:val="0"/>
-          <w:numId w:val="5"/>
-        </w:numPr>
-        <w:pBdr>
-          <w:bottom w:val="single" w:sz="8" w:space="1" w:color="EC7301"/>
-        </w:pBdr>
-        <w:spacing w:line="360" w:lineRule="auto"/>
-        <w:contextualSpacing w:val="0"/>
-        <w:rPr>
-          <w:rFonts w:cstheme="minorHAnsi"/>
-          <w:color w:val="FF5700" w:themeColor="accent1"/>
-        </w:rPr>
+        <w:pStyle w:val="Heading1"/>
       </w:pPr>
       <w:r>
-        <w:rPr>
-          <w:rFonts w:cstheme="minorHAnsi"/>
-          <w:b/>
-          <w:bCs/>
-          <w:smallCaps/>
-          <w:color w:val="FF5700"/>
-          <w:lang w:val="en-US"/>
-        </w:rPr>
-        <w:t>Description</w:t>
-      </w:r>
-      <w:r>
-        <w:rPr>
-          <w:rFonts w:cstheme="minorHAnsi"/>
-          <w:b/>
-          <w:bCs/>
-          <w:smallCaps/>
-          <w:color w:val="FF5700"/>
-          <w:lang w:val="en-US"/>
-        </w:rPr>
-        <w:t xml:space="preserve"> and </w:t>
-      </w:r>
-      <w:r>
-        <w:rPr>
-          <w:rFonts w:cstheme="minorHAnsi"/>
-          <w:b/>
-          <w:bCs/>
-          <w:smallCaps/>
-          <w:color w:val="FF5700"/>
-          <w:lang w:val="en-US"/>
-        </w:rPr>
-        <w:t>Content</w:t>
+        <w:t xml:space="preserve">Performance Scale</w:t>
       </w:r>
     </w:p>
     <w:p>
-      <w:pPr>
-        <w:jc w:val="both"/>
-        <w:rPr>
-          <w:rFonts w:cstheme="minorHAnsi"/>
-          <w:lang w:val="en-GB"/>
-        </w:rPr>
-      </w:pPr>
       <w:r>
-        <w:rPr>
-          <w:sz w:val="20"/>
-          <w:szCs w:val="20"/>
-          <w:lang w:val="en-GB"/>
-        </w:rPr>
-        <w:t xml:space="preserve">Project applying course concepts to real-world data using statistical software to study causal relations. Submission by deadline.</w:t>
-      </w:r>
-      <w:r>
-        <w:rPr>
-          <w:sz w:val="20"/>
-          <w:szCs w:val="20"/>
-          <w:lang w:val="en-GB"/>
-        </w:rPr>
-        <w:t/>
-      </w:r>
-      <w:r>
-        <w:rPr>
-          <w:sz w:val="20"/>
-          <w:szCs w:val="20"/>
-          <w:lang w:val="en-GB"/>
-        </w:rPr>
-        <w:t/>
-      </w:r>
-      <w:r>
-        <w:rPr>
-          <w:sz w:val="20"/>
-          <w:szCs w:val="20"/>
-          <w:lang w:val="en-GB"/>
-        </w:rPr>
-        <w:t/>
-      </w:r>
-      <w:r>
-        <w:rPr>
-          <w:sz w:val="20"/>
-          <w:szCs w:val="20"/>
-          <w:lang w:val="en-GB"/>
-        </w:rPr>
-        <w:t xml:space="preserve"/>
-      </w:r>
-      <w:r>
-        <w:rPr>
-          <w:sz w:val="20"/>
-          <w:szCs w:val="20"/>
-          <w:lang w:val="en-GB"/>
-        </w:rPr>
-        <w:t xml:space="preserve"/>
-      </w:r>
-      <w:r>
-        <w:rPr>
-          <w:sz w:val="20"/>
-          <w:szCs w:val="20"/>
-          <w:lang w:val="en-GB"/>
-        </w:rPr>
-        <w:t/>
-      </w:r>
-      <w:r>
-        <w:rPr>
-          <w:sz w:val="20"/>
-          <w:szCs w:val="20"/>
-          <w:lang w:val="en-GB"/>
-        </w:rPr>
-        <w:t xml:space="preserve"/>
-      </w:r>
-      <w:r>
-        <w:rPr>
-          <w:sz w:val="20"/>
-          <w:szCs w:val="20"/>
-          <w:lang w:val="en-GB"/>
-        </w:rPr>
-        <w:t xml:space="preserve"/>
-      </w:r>
-      <w:r>
-        <w:rPr>
-          <w:sz w:val="20"/>
-          <w:szCs w:val="20"/>
-          <w:lang w:val="en-GB"/>
-        </w:rPr>
-        <w:t/>
-      </w:r>
-    </w:p>
-    <w:p>
-      <w:pPr>
-        <w:pStyle w:val="ListParagraph"/>
-        <w:numPr>
-          <w:ilvl w:val="0"/>
-          <w:numId w:val="5"/>
-        </w:numPr>
-        <w:pBdr>
-          <w:bottom w:val="single" w:sz="8" w:space="1" w:color="EC7301"/>
-        </w:pBdr>
-        <w:spacing w:line="360" w:lineRule="auto"/>
-        <w:contextualSpacing w:val="0"/>
-        <w:rPr>
-          <w:rFonts w:cstheme="minorHAnsi"/>
-          <w:b/>
-          <w:bCs/>
-          <w:smallCaps/>
-          <w:color w:val="FF5700"/>
-          <w:lang w:val="en-US"/>
-        </w:rPr>
-      </w:pPr>
-      <w:r>
-        <w:rPr>
-          <w:rFonts w:cstheme="minorHAnsi"/>
-          <w:b/>
-          <w:bCs/>
-          <w:smallCaps/>
-          <w:color w:val="FF5700"/>
-          <w:lang w:val="en-US"/>
-        </w:rPr>
-        <w:t>Points and weights</w:t>
-      </w:r>
-    </w:p>
-    <w:p>
-      <w:pPr>
-        <w:pStyle w:val="ListParagraph"/>
-        <w:tabs>
-          <w:tab w:val="left" w:pos="5149"/>
-        </w:tabs>
-        <w:ind w:left="0"/>
-        <w:jc w:val="both"/>
-        <w:rPr>
-          <w:sz w:val="20"/>
-          <w:szCs w:val="20"/>
-          <w:lang w:val="en-GB"/>
-        </w:rPr>
-      </w:pPr>
-      <w:r>
-        <w:t>The project final grade is based on a written report. Due to the open nature of the project guidelines, there are not rigid questions with prescribed point values. Rather, written reports are evaluated in terms of the following key concepts:</w:t>
-      </w:r>
-    </w:p>
-    <w:p>
-      <w:pPr>
-        <w:jc w:val="center"/>
-        <w:rPr>
-          <w:rFonts w:cstheme="minorHAnsi"/>
-          <w:b/>
-          <w:bCs/>
-          <w:smallCaps/>
-          <w:color w:val="FF5700"/>
-          <w:sz w:val="16"/>
-          <w:szCs w:val="16"/>
-          <w:lang w:val="en-US"/>
-        </w:rPr>
-      </w:pPr>
-      <w:r>
-        <w:rPr>
-          <w:rFonts w:cstheme="minorHAnsi"/>
-          <w:b/>
-          <w:bCs/>
-          <w:smallCaps/>
-          <w:color w:val="FF5700"/>
-          <w:sz w:val="20"/>
-          <w:szCs w:val="20"/>
-          <w:lang w:val="en-US"/>
-        </w:rPr>
-        <w:t xml:space="preserve">Rubric for </w:t>
-      </w:r>
-      <w:r>
-        <w:rPr>
-          <w:rFonts w:cstheme="minorHAnsi"/>
-          <w:b/>
-          <w:bCs/>
-          <w:smallCaps/>
-          <w:color w:val="FF5700"/>
-          <w:sz w:val="20"/>
-          <w:szCs w:val="20"/>
-          <w:lang w:val="en-US"/>
-        </w:rPr>
-        <w:t xml:space="preserve">the project </w:t>
-      </w:r>
-      <w:r>
-        <w:rPr>
-          <w:rFonts w:cstheme="minorHAnsi"/>
-          <w:b/>
-          <w:bCs/>
-          <w:smallCaps/>
-          <w:color w:val="FF5700"/>
-          <w:sz w:val="20"/>
-          <w:szCs w:val="20"/>
-          <w:lang w:val="en-US"/>
-        </w:rPr>
-        <w:t>written report</w:t>
-      </w:r>
-      <w:r>
-        <w:rPr>
-          <w:rFonts w:cstheme="minorHAnsi"/>
-          <w:b/>
-          <w:bCs/>
-          <w:smallCaps/>
-          <w:color w:val="FF5700"/>
-          <w:sz w:val="20"/>
-          <w:szCs w:val="20"/>
-          <w:lang w:val="en-US"/>
-        </w:rPr>
-        <w:br/>
-      </w:r>
-      <w:r>
-        <w:rPr>
-          <w:rFonts w:cstheme="minorHAnsi"/>
-          <w:b/>
-          <w:bCs/>
-          <w:smallCaps/>
-          <w:color w:val="FF5700"/>
-          <w:sz w:val="16"/>
-          <w:szCs w:val="16"/>
-          <w:lang w:val="en-US"/>
-        </w:rPr>
-        <w:t>Total of 10 points</w:t>
+        <w:t xml:space="preserve">For each criterion, the score reflects the degree of correctness, completeness, and understanding shown by the group.</w:t>
       </w:r>
     </w:p>
     <w:tbl>
       <w:tblPr>
-        <w:tblW w:w="9244" w:type="dxa"/>
-        <w:tblCellSpacing w:w="15" w:type="dxa"/>
-        <w:tblCellMar>
-          <w:top w:w="15" w:type="dxa"/>
-          <w:left w:w="15" w:type="dxa"/>
-          <w:bottom w:w="15" w:type="dxa"/>
-          <w:right w:w="15" w:type="dxa"/>
-        </w:tblCellMar>
-        <w:tblLook w:val="04A0" w:firstRow="1" w:lastRow="0" w:firstColumn="1" w:lastColumn="0" w:noHBand="0" w:noVBand="1"/>
+        <w:tblW w:w="9360" w:type="dxa"/>
+        <w:tblBorders>
+          <w:top w:val="single" w:sz="4" w:space="0" w:color="999999"/>
+          <w:left w:val="single" w:sz="4" w:space="0" w:color="999999"/>
+          <w:bottom w:val="single" w:sz="4" w:space="0" w:color="999999"/>
+          <w:right w:val="single" w:sz="4" w:space="0" w:color="999999"/>
+          <w:insideH w:val="single" w:sz="4" w:space="0" w:color="CCCCCC"/>
+          <w:insideV w:val="single" w:sz="4" w:space="0" w:color="CCCCCC"/>
+        </w:tblBorders>
       </w:tblPr>
       <w:tblGrid>
-        <w:gridCol w:w="2274"/>
-        <w:gridCol w:w="6113"/>
-        <w:gridCol w:w="857"/>
+        <w:gridCol w:w="1800"/>
+        <w:gridCol w:w="7560"/>
       </w:tblGrid>
       <w:tr>
-        <w:trPr>
-          <w:tblHeader/>
-          <w:tblCellSpacing w:w="15" w:type="dxa"/>
-        </w:trPr>
         <w:tc>
           <w:tcPr>
-            <w:tcW w:w="2229" w:type="dxa"/>
-            <w:vAlign w:val="center"/>
-            <w:hideMark/>
+            <w:tcW w:w="1800" w:type="dxa"/>
           </w:tcPr>
           <w:p>
-            <w:pPr>
-              <w:rPr>
-                <w:rFonts w:cstheme="minorHAnsi"/>
-                <w:b/>
-                <w:bCs/>
-                <w:smallCaps/>
-                <w:color w:val="FF5700"/>
-                <w:sz w:val="20"/>
-                <w:szCs w:val="20"/>
-                <w:lang w:val="en-US"/>
-              </w:rPr>
-            </w:pPr>
             <w:r>
               <w:rPr>
-                <w:rFonts w:cstheme="minorHAnsi"/>
                 <w:b/>
-                <w:bCs/>
-                <w:smallCaps/>
-                <w:color w:val="FF5700"/>
-                <w:sz w:val="20"/>
-                <w:szCs w:val="20"/>
-                <w:lang w:val="en-US"/>
               </w:rPr>
-              <w:t>Concept</w:t>
+              <w:t xml:space="preserve">Range</w:t>
             </w:r>
           </w:p>
         </w:tc>
         <w:tc>
           <w:tcPr>
-            <w:tcW w:w="6083" w:type="dxa"/>
-            <w:vAlign w:val="center"/>
-            <w:hideMark/>
+            <w:tcW w:w="7560" w:type="dxa"/>
           </w:tcPr>
           <w:p>
-            <w:pPr>
-              <w:rPr>
-                <w:rFonts w:cstheme="minorHAnsi"/>
-                <w:b/>
-                <w:bCs/>
-                <w:smallCaps/>
-                <w:color w:val="FF5700"/>
-                <w:sz w:val="20"/>
-                <w:szCs w:val="20"/>
-                <w:lang w:val="en-US"/>
-              </w:rPr>
-            </w:pPr>
             <w:r>
               <w:rPr>
-                <w:rFonts w:cstheme="minorHAnsi"/>
                 <w:b/>
-                <w:bCs/>
-                <w:smallCaps/>
-                <w:color w:val="FF5700"/>
-                <w:sz w:val="20"/>
-                <w:szCs w:val="20"/>
-                <w:lang w:val="en-US"/>
               </w:rPr>
-              <w:t>Description</w:t>
+              <w:t xml:space="preserve">Interpretation</w:t>
+            </w:r>
+          </w:p>
+        </w:tc>
+      </w:tr>
+      <w:tr>
+        <w:tc>
+          <w:tcPr>
+            <w:tcW w:w="1800" w:type="dxa"/>
+          </w:tcPr>
+          <w:p>
+            <w:r>
+              <w:rPr/>
+              <w:t xml:space="preserve">0-25%</w:t>
             </w:r>
           </w:p>
         </w:tc>
         <w:tc>
           <w:tcPr>
-            <w:tcW w:w="812" w:type="dxa"/>
-            <w:vAlign w:val="center"/>
-            <w:hideMark/>
+            <w:tcW w:w="7560" w:type="dxa"/>
           </w:tcPr>
           <w:p>
-            <w:pPr>
-              <w:jc w:val="center"/>
-              <w:rPr>
-                <w:rFonts w:cstheme="minorHAnsi"/>
-                <w:b/>
-                <w:bCs/>
-                <w:smallCaps/>
-                <w:color w:val="FF5700"/>
-                <w:sz w:val="20"/>
-                <w:szCs w:val="20"/>
-                <w:lang w:val="en-US"/>
-              </w:rPr>
-            </w:pPr>
             <w:r>
-              <w:rPr>
-                <w:rFonts w:cstheme="minorHAnsi"/>
-                <w:b/>
-                <w:bCs/>
-                <w:smallCaps/>
-                <w:color w:val="FF5700"/>
-                <w:sz w:val="20"/>
-                <w:szCs w:val="20"/>
-                <w:lang w:val="en-US"/>
-              </w:rPr>
-              <w:t>Weight</w:t>
+              <w:rPr/>
+              <w:t xml:space="preserve">Many errors or misconceptions; minimal understanding; claims are unsupported or mostly disconnected from the paper.</w:t>
             </w:r>
           </w:p>
         </w:tc>
       </w:tr>
       <w:tr>
-        <w:trPr>
-          <w:tblCellSpacing w:w="15" w:type="dxa"/>
-        </w:trPr>
         <w:tc>
           <w:tcPr>
-            <w:tcW w:w="2229" w:type="dxa"/>
-            <w:vAlign w:val="center"/>
-            <w:hideMark/>
+            <w:tcW w:w="1800" w:type="dxa"/>
           </w:tcPr>
           <w:p>
-            <w:pPr>
-              <w:rPr>
-                <w:sz w:val="20"/>
-                <w:szCs w:val="20"/>
-              </w:rPr>
-            </w:pPr>
             <w:r>
-              <w:rPr>
-                <w:b/>
-                <w:bCs/>
-                <w:sz w:val="20"/>
-                <w:szCs w:val="20"/>
-              </w:rPr>
-              <w:t>Causal</w:t>
-            </w:r>
-            <w:r>
-              <w:rPr>
-                <w:b/>
-                <w:bCs/>
-                <w:sz w:val="20"/>
-                <w:szCs w:val="20"/>
-              </w:rPr>
-              <w:t xml:space="preserve"> </w:t>
-            </w:r>
-            <w:proofErr w:type="spellStart"/>
-            <w:r>
-              <w:rPr>
-                <w:b/>
-                <w:bCs/>
-                <w:sz w:val="20"/>
-                <w:szCs w:val="20"/>
-              </w:rPr>
-              <w:t>Inference</w:t>
-            </w:r>
-            <w:proofErr w:type="spellEnd"/>
-          </w:p>
-        </w:tc>
-        <w:tc>
-          <w:tcPr>
-            <w:tcW w:w="6083" w:type="dxa"/>
-            <w:vAlign w:val="center"/>
-            <w:hideMark/>
-          </w:tcPr>
-          <w:p>
-            <w:pPr>
-              <w:rPr>
-                <w:sz w:val="20"/>
-                <w:szCs w:val="20"/>
-                <w:lang w:val="en-GB"/>
-              </w:rPr>
-            </w:pPr>
-            <w:r>
-              <w:rPr>
-                <w:sz w:val="20"/>
-                <w:szCs w:val="20"/>
-                <w:lang w:val="en-GB"/>
-              </w:rPr>
-              <w:t>Treatment/control, outcome, randomization or identifying assumption, and appropriate comparisons.</w:t>
+              <w:rPr/>
+              <w:t xml:space="preserve">25-50%</w:t>
             </w:r>
           </w:p>
         </w:tc>
         <w:tc>
           <w:tcPr>
-            <w:tcW w:w="812" w:type="dxa"/>
-            <w:vAlign w:val="center"/>
-            <w:hideMark/>
+            <w:tcW w:w="7560" w:type="dxa"/>
           </w:tcPr>
           <w:p>
-            <w:pPr>
-              <w:jc w:val="center"/>
-              <w:rPr>
-                <w:sz w:val="20"/>
-                <w:szCs w:val="20"/>
-              </w:rPr>
-            </w:pPr>
             <w:r>
-              <w:rPr>
-                <w:sz w:val="20"/>
-                <w:szCs w:val="20"/>
-              </w:rPr>
-              <w:t>25%</w:t>
+              <w:rPr/>
+              <w:t xml:space="preserve">Mostly incomplete or incorrect; some understanding is visible, but major elements are missing or confused.</w:t>
             </w:r>
           </w:p>
         </w:tc>
       </w:tr>
       <w:tr>
-        <w:trPr>
-          <w:tblCellSpacing w:w="15" w:type="dxa"/>
-        </w:trPr>
         <w:tc>
           <w:tcPr>
-            <w:tcW w:w="2229" w:type="dxa"/>
-            <w:vAlign w:val="center"/>
-            <w:hideMark/>
+            <w:tcW w:w="1800" w:type="dxa"/>
           </w:tcPr>
           <w:p>
-            <w:pPr>
-              <w:rPr>
-                <w:b/>
-                <w:bCs/>
-                <w:sz w:val="20"/>
-                <w:szCs w:val="20"/>
-              </w:rPr>
-            </w:pPr>
-            <w:proofErr w:type="spellStart"/>
             <w:r>
-              <w:rPr>
-                <w:b/>
-                <w:bCs/>
-                <w:sz w:val="20"/>
-                <w:szCs w:val="20"/>
-              </w:rPr>
-              <w:t>Interpretation</w:t>
-            </w:r>
-            <w:proofErr w:type="spellEnd"/>
-          </w:p>
-        </w:tc>
-        <w:tc>
-          <w:tcPr>
-            <w:tcW w:w="6083" w:type="dxa"/>
-            <w:vAlign w:val="center"/>
-            <w:hideMark/>
-          </w:tcPr>
-          <w:p>
-            <w:pPr>
-              <w:rPr>
-                <w:sz w:val="20"/>
-                <w:szCs w:val="20"/>
-                <w:lang w:val="en-GB"/>
-              </w:rPr>
-            </w:pPr>
-            <w:r>
-              <w:rPr>
-                <w:sz w:val="20"/>
-                <w:szCs w:val="20"/>
-                <w:lang w:val="en-GB"/>
-              </w:rPr>
-              <w:t>Direction, magnitude, substantive meaning, limitations, and conclusions.</w:t>
+              <w:rPr/>
+              <w:t xml:space="preserve">50-75%</w:t>
             </w:r>
           </w:p>
         </w:tc>
         <w:tc>
           <w:tcPr>
-            <w:tcW w:w="812" w:type="dxa"/>
-            <w:vAlign w:val="center"/>
-            <w:hideMark/>
+            <w:tcW w:w="7560" w:type="dxa"/>
           </w:tcPr>
           <w:p>
-            <w:pPr>
-              <w:jc w:val="center"/>
-              <w:rPr>
-                <w:sz w:val="20"/>
-                <w:szCs w:val="20"/>
-              </w:rPr>
-            </w:pPr>
             <w:r>
-              <w:rPr>
-                <w:sz w:val="20"/>
-                <w:szCs w:val="20"/>
-              </w:rPr>
-              <w:t>30%</w:t>
+              <w:rPr/>
+              <w:t xml:space="preserve">Partially correct and reasonably complete; shows fair understanding but with important gaps or unclear interpretation.</w:t>
             </w:r>
           </w:p>
         </w:tc>
       </w:tr>
       <w:tr>
-        <w:trPr>
-          <w:tblCellSpacing w:w="15" w:type="dxa"/>
-        </w:trPr>
         <w:tc>
           <w:tcPr>
-            <w:tcW w:w="2229" w:type="dxa"/>
-            <w:vAlign w:val="center"/>
-            <w:hideMark/>
+            <w:tcW w:w="1800" w:type="dxa"/>
           </w:tcPr>
           <w:p>
-            <w:pPr>
-              <w:rPr>
-                <w:b/>
-                <w:bCs/>
-                <w:sz w:val="20"/>
-                <w:szCs w:val="20"/>
-              </w:rPr>
-            </w:pPr>
             <w:r>
-              <w:rPr>
-                <w:b/>
-                <w:bCs/>
-                <w:sz w:val="20"/>
-                <w:szCs w:val="20"/>
-              </w:rPr>
-              <w:t xml:space="preserve">Code </w:t>
-            </w:r>
-            <w:proofErr w:type="spellStart"/>
-            <w:r>
-              <w:rPr>
-                <w:b/>
-                <w:bCs/>
-                <w:sz w:val="20"/>
-                <w:szCs w:val="20"/>
-              </w:rPr>
-              <w:t>Quality</w:t>
-            </w:r>
-            <w:proofErr w:type="spellEnd"/>
-          </w:p>
-        </w:tc>
-        <w:tc>
-          <w:tcPr>
-            <w:tcW w:w="6083" w:type="dxa"/>
-            <w:vAlign w:val="center"/>
-            <w:hideMark/>
-          </w:tcPr>
-          <w:p>
-            <w:pPr>
-              <w:rPr>
-                <w:sz w:val="20"/>
-                <w:szCs w:val="20"/>
-                <w:lang w:val="en-GB"/>
-              </w:rPr>
-            </w:pPr>
-            <w:r>
-              <w:rPr>
-                <w:sz w:val="20"/>
-                <w:szCs w:val="20"/>
-                <w:lang w:val="en-GB"/>
-              </w:rPr>
-              <w:t>Readable, reproducible R code, correct variable construction, and code that runs without errors.</w:t>
+              <w:rPr/>
+              <w:t xml:space="preserve">75-100%</w:t>
             </w:r>
           </w:p>
         </w:tc>
         <w:tc>
           <w:tcPr>
-            <w:tcW w:w="812" w:type="dxa"/>
-            <w:vAlign w:val="center"/>
-            <w:hideMark/>
+            <w:tcW w:w="7560" w:type="dxa"/>
           </w:tcPr>
           <w:p>
-            <w:pPr>
-              <w:jc w:val="center"/>
-              <w:rPr>
-                <w:sz w:val="20"/>
-                <w:szCs w:val="20"/>
-              </w:rPr>
-            </w:pPr>
             <w:r>
-              <w:rPr>
-                <w:sz w:val="20"/>
-                <w:szCs w:val="20"/>
-              </w:rPr>
-              <w:t>20%</w:t>
+              <w:rPr/>
+              <w:t xml:space="preserve">Mostly correct, complete, and well explained; strong understanding, precise language, and sound interpretation.</w:t>
             </w:r>
           </w:p>
         </w:tc>
       </w:tr>
-      <w:tr>
-        <w:trPr>
-          <w:tblCellSpacing w:w="15" w:type="dxa"/>
-        </w:trPr>
-        <w:tc>
-          <w:tcPr>
-            <w:tcW w:w="2229" w:type="dxa"/>
-            <w:vAlign w:val="center"/>
-            <w:hideMark/>
-          </w:tcPr>
-          <w:p>
-            <w:pPr>
-              <w:rPr>
-                <w:b/>
-                <w:bCs/>
-                <w:sz w:val="20"/>
-                <w:szCs w:val="20"/>
-              </w:rPr>
-            </w:pPr>
-            <w:proofErr w:type="spellStart"/>
-            <w:r>
-              <w:rPr>
-                <w:b/>
-                <w:bCs/>
-                <w:sz w:val="20"/>
-                <w:szCs w:val="20"/>
-              </w:rPr>
-              <w:t>Report</w:t>
-            </w:r>
-            <w:proofErr w:type="spellEnd"/>
-            <w:r>
-              <w:rPr>
-                <w:b/>
-                <w:bCs/>
-                <w:sz w:val="20"/>
-                <w:szCs w:val="20"/>
-              </w:rPr>
-              <w:t xml:space="preserve"> Clarity &amp; </w:t>
-            </w:r>
-            <w:proofErr w:type="spellStart"/>
-            <w:r>
-              <w:rPr>
-                <w:b/>
-                <w:bCs/>
-                <w:sz w:val="20"/>
-                <w:szCs w:val="20"/>
-              </w:rPr>
-              <w:t>Organization</w:t>
-            </w:r>
-            <w:proofErr w:type="spellEnd"/>
-          </w:p>
-        </w:tc>
-        <w:tc>
-          <w:tcPr>
-            <w:tcW w:w="6083" w:type="dxa"/>
-            <w:vAlign w:val="center"/>
-            <w:hideMark/>
-          </w:tcPr>
-          <w:p>
-            <w:pPr>
-              <w:rPr>
-                <w:sz w:val="20"/>
-                <w:szCs w:val="20"/>
-                <w:lang w:val="en-GB"/>
-              </w:rPr>
-            </w:pPr>
-            <w:r>
-              <w:rPr>
-                <w:sz w:val="20"/>
-                <w:szCs w:val="20"/>
-                <w:lang w:val="en-GB"/>
-              </w:rPr>
-              <w:t>Well organized, concise, readable tables/figures, and polished writing.</w:t>
-            </w:r>
-          </w:p>
-        </w:tc>
-        <w:tc>
-          <w:tcPr>
-            <w:tcW w:w="812" w:type="dxa"/>
-            <w:vAlign w:val="center"/>
-            <w:hideMark/>
-          </w:tcPr>
-          <w:p>
-            <w:pPr>
-              <w:jc w:val="center"/>
-              <w:rPr>
-                <w:sz w:val="20"/>
-                <w:szCs w:val="20"/>
-              </w:rPr>
-            </w:pPr>
-            <w:r>
-              <w:rPr>
-                <w:sz w:val="20"/>
-                <w:szCs w:val="20"/>
-              </w:rPr>
-              <w:t>25%</w:t>
-            </w:r>
-          </w:p>
-        </w:tc>
-      </w:tr>
-      <w:tr>
-        <w:trPr>
-          <w:tblCellSpacing w:w="15" w:type="dxa"/>
-        </w:trPr>
-        <w:tc>
-          <w:tcPr>
-            <w:tcW w:w="2229" w:type="dxa"/>
-            <w:vAlign w:val="center"/>
-          </w:tcPr>
-          <w:p>
-            <w:pPr>
-              <w:rPr>
-                <w:b/>
-                <w:bCs/>
-                <w:sz w:val="20"/>
-                <w:szCs w:val="20"/>
-              </w:rPr>
-            </w:pPr>
-          </w:p>
-        </w:tc>
-        <w:tc>
-          <w:tcPr>
-            <w:tcW w:w="6083" w:type="dxa"/>
-            <w:vAlign w:val="center"/>
-          </w:tcPr>
-          <w:p>
-            <w:pPr>
-              <w:rPr>
-                <w:sz w:val="20"/>
-                <w:szCs w:val="20"/>
-                <w:lang w:val="en-GB"/>
-              </w:rPr>
-            </w:pPr>
-          </w:p>
-        </w:tc>
-        <w:tc>
-          <w:tcPr>
-            <w:tcW w:w="812" w:type="dxa"/>
-            <w:vAlign w:val="center"/>
-          </w:tcPr>
-          <w:p>
-            <w:pPr>
-              <w:jc w:val="center"/>
-              <w:rPr>
-                <w:sz w:val="20"/>
-                <w:szCs w:val="20"/>
-              </w:rPr>
-            </w:pPr>
-          </w:p>
-        </w:tc>
-      </w:tr>
     </w:tbl>
-    <w:p>
-      <w:pPr>
-        <w:pStyle w:val="ListParagraph"/>
-        <w:numPr>
-          <w:ilvl w:val="0"/>
-          <w:numId w:val="5"/>
-        </w:numPr>
-        <w:pBdr>
-          <w:bottom w:val="single" w:sz="8" w:space="1" w:color="EC7301"/>
-        </w:pBdr>
-        <w:spacing w:line="360" w:lineRule="auto"/>
-        <w:contextualSpacing w:val="0"/>
-        <w:rPr>
-          <w:lang w:val="en-GB"/>
-        </w:rPr>
-      </w:pPr>
-      <w:proofErr w:type="gramStart"/>
-      <w:r>
-        <w:rPr>
-          <w:rFonts w:cstheme="minorHAnsi"/>
-          <w:b/>
-          <w:bCs/>
-          <w:smallCaps/>
-          <w:color w:val="FF5700"/>
-          <w:lang w:val="en-US"/>
-        </w:rPr>
-        <w:t>Evaluation</w:t>
-      </w:r>
-      <w:proofErr w:type="gramEnd"/>
-      <w:r>
-        <w:rPr>
-          <w:rFonts w:cstheme="minorHAnsi"/>
-          <w:b/>
-          <w:bCs/>
-          <w:smallCaps/>
-          <w:color w:val="FF5700"/>
-          <w:lang w:val="en-US"/>
-        </w:rPr>
-        <w:t xml:space="preserve"> Method and Criteria</w:t>
-      </w:r>
-    </w:p>
-    <w:tbl>
-      <w:tblPr>
-        <w:tblW w:w="8387" w:type="dxa"/>
-        <w:tblCellSpacing w:w="15" w:type="dxa"/>
-        <w:tblCellMar>
-          <w:top w:w="15" w:type="dxa"/>
-          <w:left w:w="15" w:type="dxa"/>
-          <w:bottom w:w="15" w:type="dxa"/>
-          <w:right w:w="15" w:type="dxa"/>
-        </w:tblCellMar>
-        <w:tblLook w:val="04A0" w:firstRow="1" w:lastRow="0" w:firstColumn="1" w:lastColumn="0" w:noHBand="0" w:noVBand="1"/>
-      </w:tblPr>
-      <w:tblGrid>
-        <w:gridCol w:w="2274"/>
-        <w:gridCol w:w="6113"/>
-      </w:tblGrid>
-      <w:tr>
-        <w:trPr>
-          <w:tblCellSpacing w:w="15" w:type="dxa"/>
-        </w:trPr>
-        <w:tc>
-          <w:tcPr>
-            <w:tcW w:w="2229" w:type="dxa"/>
-            <w:vAlign w:val="center"/>
-            <w:hideMark/>
-          </w:tcPr>
-          <w:p/>
-        </w:tc>
-        <w:tc>
-          <w:tcPr>
-            <w:tcW w:w="6068" w:type="dxa"/>
-            <w:vAlign w:val="center"/>
-            <w:hideMark/>
-          </w:tcPr>
-          <w:p/>
-        </w:tc>
-      </w:tr>
-    </w:tbl>
-    <w:p>
-      <w:pPr>
-        <w:tabs>
-          <w:tab w:val="left" w:pos="5149"/>
-        </w:tabs>
-        <w:jc w:val="both"/>
-        <w:rPr>
-          <w:sz w:val="20"/>
-          <w:szCs w:val="20"/>
-          <w:lang w:val="en-GB"/>
-        </w:rPr>
-      </w:pPr>
-      <w:r>
-        <w:rPr>
-          <w:sz w:val="20"/>
-          <w:szCs w:val="20"/>
-          <w:lang w:val="en-GB"/>
-        </w:rPr>
-        <w:t>The</w:t>
-      </w:r>
-      <w:r>
-        <w:rPr>
-          <w:sz w:val="20"/>
-          <w:szCs w:val="20"/>
-          <w:lang w:val="en-GB"/>
-        </w:rPr>
-        <w:t xml:space="preserve"> grade </w:t>
-      </w:r>
-      <w:r>
-        <w:rPr>
-          <w:sz w:val="20"/>
-          <w:szCs w:val="20"/>
-          <w:lang w:val="en-GB"/>
-        </w:rPr>
-        <w:t xml:space="preserve">of each concept </w:t>
-      </w:r>
-      <w:r>
-        <w:rPr>
-          <w:sz w:val="20"/>
-          <w:szCs w:val="20"/>
-          <w:lang w:val="en-GB"/>
-        </w:rPr>
-        <w:t>is chosen to reflect</w:t>
-      </w:r>
-      <w:r>
-        <w:rPr>
-          <w:sz w:val="20"/>
-          <w:szCs w:val="20"/>
-          <w:lang w:val="en-GB"/>
-        </w:rPr>
-        <w:t xml:space="preserve"> the degree of correctness</w:t>
-      </w:r>
-      <w:r>
-        <w:rPr>
-          <w:sz w:val="20"/>
-          <w:szCs w:val="20"/>
-          <w:lang w:val="en-GB"/>
-        </w:rPr>
-        <w:t xml:space="preserve"> and understanding</w:t>
-      </w:r>
-      <w:r>
-        <w:rPr>
-          <w:sz w:val="20"/>
-          <w:szCs w:val="20"/>
-          <w:lang w:val="en-GB"/>
-        </w:rPr>
-        <w:t xml:space="preserve"> of the students’ </w:t>
-      </w:r>
-      <w:r>
-        <w:rPr>
-          <w:sz w:val="20"/>
-          <w:szCs w:val="20"/>
-          <w:lang w:val="en-GB"/>
-        </w:rPr>
-        <w:t>performance</w:t>
-      </w:r>
-      <w:r>
-        <w:rPr>
-          <w:sz w:val="20"/>
-          <w:szCs w:val="20"/>
-          <w:lang w:val="en-GB"/>
-        </w:rPr>
-        <w:t xml:space="preserve"> according to the </w:t>
-      </w:r>
-      <w:r>
-        <w:rPr>
-          <w:sz w:val="20"/>
-          <w:szCs w:val="20"/>
-          <w:lang w:val="en-GB"/>
-        </w:rPr>
-        <w:t>following</w:t>
-      </w:r>
-      <w:r>
-        <w:rPr>
-          <w:sz w:val="20"/>
-          <w:szCs w:val="20"/>
-          <w:lang w:val="en-GB"/>
-        </w:rPr>
-        <w:t xml:space="preserve"> criteria</w:t>
-      </w:r>
-      <w:r>
-        <w:rPr>
-          <w:sz w:val="20"/>
-          <w:szCs w:val="20"/>
-          <w:lang w:val="en-GB"/>
-        </w:rPr>
-        <w:t>:</w:t>
-      </w:r>
-    </w:p>
-    <w:p>
-      <w:pPr>
-        <w:pStyle w:val="ListParagraph"/>
-        <w:numPr>
-          <w:ilvl w:val="0"/>
-          <w:numId w:val="33"/>
-        </w:numPr>
-        <w:tabs>
-          <w:tab w:val="left" w:pos="5149"/>
-        </w:tabs>
-        <w:jc w:val="both"/>
-        <w:rPr>
-          <w:sz w:val="20"/>
-          <w:szCs w:val="20"/>
-          <w:lang w:val="en-GB"/>
-        </w:rPr>
-      </w:pPr>
-      <w:r>
-        <w:rPr>
-          <w:b/>
-          <w:bCs/>
-          <w:sz w:val="20"/>
-          <w:szCs w:val="20"/>
-          <w:lang w:val="en-GB"/>
-        </w:rPr>
-        <w:t>0-</w:t>
-      </w:r>
-      <w:r>
-        <w:rPr>
-          <w:b/>
-          <w:bCs/>
-          <w:sz w:val="20"/>
-          <w:szCs w:val="20"/>
-          <w:lang w:val="en-GB"/>
-        </w:rPr>
-        <w:t>2</w:t>
-      </w:r>
-      <w:r>
-        <w:rPr>
-          <w:b/>
-          <w:bCs/>
-          <w:sz w:val="20"/>
-          <w:szCs w:val="20"/>
-          <w:lang w:val="en-GB"/>
-        </w:rPr>
-        <w:t>5</w:t>
-      </w:r>
-      <w:r>
-        <w:rPr>
-          <w:b/>
-          <w:bCs/>
-          <w:sz w:val="20"/>
-          <w:szCs w:val="20"/>
-          <w:lang w:val="en-GB"/>
-        </w:rPr>
-        <w:t>%</w:t>
-      </w:r>
-      <w:r>
-        <w:rPr>
-          <w:b/>
-          <w:bCs/>
-          <w:sz w:val="20"/>
-          <w:szCs w:val="20"/>
-          <w:lang w:val="en-GB"/>
-        </w:rPr>
-        <w:t>:</w:t>
-      </w:r>
-      <w:r>
-        <w:rPr>
-          <w:sz w:val="20"/>
-          <w:szCs w:val="20"/>
-          <w:lang w:val="en-GB"/>
-        </w:rPr>
-        <w:t xml:space="preserve"> </w:t>
-      </w:r>
-      <w:r>
-        <w:rPr>
-          <w:sz w:val="20"/>
-          <w:szCs w:val="20"/>
-          <w:lang w:val="en-GB"/>
-        </w:rPr>
-        <w:t xml:space="preserve">Many errors, typos, misconceptions; </w:t>
-      </w:r>
-      <w:r>
-        <w:rPr>
-          <w:sz w:val="20"/>
-          <w:szCs w:val="20"/>
-          <w:lang w:val="en-GB"/>
-        </w:rPr>
-        <w:t>implies</w:t>
-      </w:r>
-      <w:r>
-        <w:rPr>
-          <w:sz w:val="20"/>
-          <w:szCs w:val="20"/>
-          <w:lang w:val="en-GB"/>
-        </w:rPr>
-        <w:t xml:space="preserve"> minimal understanding; no justification.</w:t>
-      </w:r>
-    </w:p>
-    <w:p>
-      <w:pPr>
-        <w:pStyle w:val="ListParagraph"/>
-        <w:numPr>
-          <w:ilvl w:val="0"/>
-          <w:numId w:val="33"/>
-        </w:numPr>
-        <w:tabs>
-          <w:tab w:val="left" w:pos="5149"/>
-        </w:tabs>
-        <w:jc w:val="both"/>
-        <w:rPr>
-          <w:sz w:val="20"/>
-          <w:szCs w:val="20"/>
-          <w:lang w:val="en-GB"/>
-        </w:rPr>
-      </w:pPr>
-      <w:r>
-        <w:rPr>
-          <w:b/>
-          <w:bCs/>
-          <w:sz w:val="20"/>
-          <w:szCs w:val="20"/>
-          <w:lang w:val="en-GB"/>
-        </w:rPr>
-        <w:t>25</w:t>
-      </w:r>
-      <w:r>
-        <w:rPr>
-          <w:b/>
-          <w:bCs/>
-          <w:sz w:val="20"/>
-          <w:szCs w:val="20"/>
-          <w:lang w:val="en-GB"/>
-        </w:rPr>
-        <w:t>%</w:t>
-      </w:r>
-      <w:r>
-        <w:rPr>
-          <w:b/>
-          <w:bCs/>
-          <w:sz w:val="20"/>
-          <w:szCs w:val="20"/>
-          <w:lang w:val="en-GB"/>
-        </w:rPr>
-        <w:t>-5</w:t>
-      </w:r>
-      <w:r>
-        <w:rPr>
-          <w:b/>
-          <w:bCs/>
-          <w:sz w:val="20"/>
-          <w:szCs w:val="20"/>
-          <w:lang w:val="en-GB"/>
-        </w:rPr>
-        <w:t>0%</w:t>
-      </w:r>
-      <w:r>
-        <w:rPr>
-          <w:b/>
-          <w:bCs/>
-          <w:sz w:val="20"/>
-          <w:szCs w:val="20"/>
-          <w:lang w:val="en-GB"/>
-        </w:rPr>
-        <w:t>:</w:t>
-      </w:r>
-      <w:r>
-        <w:rPr>
-          <w:sz w:val="20"/>
-          <w:szCs w:val="20"/>
-          <w:lang w:val="en-GB"/>
-        </w:rPr>
-        <w:t xml:space="preserve"> Mostly incorrect or incomplete; shows some understanding but with major errors</w:t>
-      </w:r>
-      <w:r>
-        <w:rPr>
-          <w:sz w:val="20"/>
-          <w:szCs w:val="20"/>
-          <w:lang w:val="en-GB"/>
-        </w:rPr>
-        <w:t>,</w:t>
-      </w:r>
-      <w:r>
-        <w:rPr>
-          <w:sz w:val="20"/>
-          <w:szCs w:val="20"/>
-          <w:lang w:val="en-GB"/>
-        </w:rPr>
-        <w:t xml:space="preserve"> gaps</w:t>
-      </w:r>
-      <w:r>
-        <w:rPr>
-          <w:sz w:val="20"/>
-          <w:szCs w:val="20"/>
-          <w:lang w:val="en-GB"/>
-        </w:rPr>
-        <w:t xml:space="preserve">, and weak </w:t>
-      </w:r>
-      <w:r>
-        <w:rPr>
-          <w:sz w:val="20"/>
-          <w:szCs w:val="20"/>
-          <w:lang w:val="en-GB"/>
-        </w:rPr>
-        <w:t>conclusions</w:t>
-      </w:r>
-      <w:r>
-        <w:rPr>
-          <w:sz w:val="20"/>
-          <w:szCs w:val="20"/>
-          <w:lang w:val="en-GB"/>
-        </w:rPr>
-        <w:t>.</w:t>
-      </w:r>
-    </w:p>
-    <w:p>
-      <w:pPr>
-        <w:pStyle w:val="ListParagraph"/>
-        <w:numPr>
-          <w:ilvl w:val="0"/>
-          <w:numId w:val="33"/>
-        </w:numPr>
-        <w:tabs>
-          <w:tab w:val="left" w:pos="5149"/>
-        </w:tabs>
-        <w:jc w:val="both"/>
-        <w:rPr>
-          <w:sz w:val="20"/>
-          <w:szCs w:val="20"/>
-          <w:lang w:val="en-GB"/>
-        </w:rPr>
-      </w:pPr>
-      <w:r>
-        <w:rPr>
-          <w:b/>
-          <w:bCs/>
-          <w:sz w:val="20"/>
-          <w:szCs w:val="20"/>
-          <w:lang w:val="en-GB"/>
-        </w:rPr>
-        <w:t>5</w:t>
-      </w:r>
-      <w:r>
-        <w:rPr>
-          <w:b/>
-          <w:bCs/>
-          <w:sz w:val="20"/>
-          <w:szCs w:val="20"/>
-          <w:lang w:val="en-GB"/>
-        </w:rPr>
-        <w:t>0%</w:t>
-      </w:r>
-      <w:r>
-        <w:rPr>
-          <w:b/>
-          <w:bCs/>
-          <w:sz w:val="20"/>
-          <w:szCs w:val="20"/>
-          <w:lang w:val="en-GB"/>
-        </w:rPr>
-        <w:t>-</w:t>
-      </w:r>
-      <w:r>
-        <w:rPr>
-          <w:b/>
-          <w:bCs/>
-          <w:sz w:val="20"/>
-          <w:szCs w:val="20"/>
-          <w:lang w:val="en-GB"/>
-        </w:rPr>
-        <w:t>7</w:t>
-      </w:r>
-      <w:r>
-        <w:rPr>
-          <w:b/>
-          <w:bCs/>
-          <w:sz w:val="20"/>
-          <w:szCs w:val="20"/>
-          <w:lang w:val="en-GB"/>
-        </w:rPr>
-        <w:t>5</w:t>
-      </w:r>
-      <w:r>
-        <w:rPr>
-          <w:b/>
-          <w:bCs/>
-          <w:sz w:val="20"/>
-          <w:szCs w:val="20"/>
-          <w:lang w:val="en-GB"/>
-        </w:rPr>
-        <w:t>%</w:t>
-      </w:r>
-      <w:r>
-        <w:rPr>
-          <w:b/>
-          <w:bCs/>
-          <w:sz w:val="20"/>
-          <w:szCs w:val="20"/>
-          <w:lang w:val="en-GB"/>
-        </w:rPr>
-        <w:t>:</w:t>
-      </w:r>
-      <w:r>
-        <w:rPr>
-          <w:sz w:val="20"/>
-          <w:szCs w:val="20"/>
-          <w:lang w:val="en-GB"/>
-        </w:rPr>
-        <w:t xml:space="preserve"> Partially correct and complete; shows a fair understanding of the concepts.</w:t>
-      </w:r>
-    </w:p>
-    <w:p>
-      <w:pPr>
-        <w:pStyle w:val="ListParagraph"/>
-        <w:numPr>
-          <w:ilvl w:val="0"/>
-          <w:numId w:val="33"/>
-        </w:numPr>
-        <w:tabs>
-          <w:tab w:val="left" w:pos="5149"/>
-        </w:tabs>
-        <w:jc w:val="both"/>
-        <w:rPr>
-          <w:lang w:val="en-GB"/>
-        </w:rPr>
-      </w:pPr>
-      <w:r>
-        <w:rPr>
-          <w:b/>
-          <w:bCs/>
-          <w:sz w:val="20"/>
-          <w:szCs w:val="20"/>
-          <w:lang w:val="en-GB"/>
-        </w:rPr>
-        <w:t>75</w:t>
-      </w:r>
-      <w:r>
-        <w:rPr>
-          <w:b/>
-          <w:bCs/>
-          <w:sz w:val="20"/>
-          <w:szCs w:val="20"/>
-          <w:lang w:val="en-GB"/>
-        </w:rPr>
-        <w:t>%</w:t>
-      </w:r>
-      <w:r>
-        <w:rPr>
-          <w:b/>
-          <w:bCs/>
-          <w:sz w:val="20"/>
-          <w:szCs w:val="20"/>
-          <w:lang w:val="en-GB"/>
-        </w:rPr>
-        <w:t>-1</w:t>
-      </w:r>
-      <w:r>
-        <w:rPr>
-          <w:b/>
-          <w:bCs/>
-          <w:sz w:val="20"/>
-          <w:szCs w:val="20"/>
-          <w:lang w:val="en-GB"/>
-        </w:rPr>
-        <w:t>00%</w:t>
-      </w:r>
-      <w:r>
-        <w:rPr>
-          <w:b/>
-          <w:bCs/>
-          <w:sz w:val="20"/>
-          <w:szCs w:val="20"/>
-          <w:lang w:val="en-GB"/>
-        </w:rPr>
-        <w:t>:</w:t>
-      </w:r>
-      <w:r>
-        <w:rPr>
-          <w:sz w:val="20"/>
-          <w:szCs w:val="20"/>
-          <w:lang w:val="en-GB"/>
-        </w:rPr>
-        <w:t xml:space="preserve"> Mostly correct and complete; strong understanding</w:t>
-      </w:r>
-      <w:r>
-        <w:rPr>
-          <w:sz w:val="20"/>
-          <w:szCs w:val="20"/>
-          <w:lang w:val="en-GB"/>
-        </w:rPr>
-        <w:t xml:space="preserve"> and sound conclusions</w:t>
-      </w:r>
-      <w:r>
-        <w:rPr>
-          <w:sz w:val="20"/>
-          <w:szCs w:val="20"/>
-          <w:lang w:val="en-GB"/>
-        </w:rPr>
-        <w:t xml:space="preserve">; minor </w:t>
-      </w:r>
-      <w:r>
-        <w:rPr>
-          <w:sz w:val="20"/>
-          <w:szCs w:val="20"/>
-          <w:lang w:val="en-GB"/>
-        </w:rPr>
-        <w:t xml:space="preserve">to </w:t>
-      </w:r>
-      <w:r>
-        <w:rPr>
-          <w:sz w:val="20"/>
-          <w:szCs w:val="20"/>
-          <w:lang w:val="en-GB"/>
-        </w:rPr>
-        <w:t>no errors</w:t>
-      </w:r>
-      <w:r>
-        <w:rPr>
-          <w:sz w:val="20"/>
-          <w:szCs w:val="20"/>
-          <w:lang w:val="en-GB"/>
-        </w:rPr>
-        <w:t>.</w:t>
-      </w:r>
-    </w:p>
-    <w:p>
-      <w:pPr>
-        <w:tabs>
-          <w:tab w:val="left" w:pos="5149"/>
-        </w:tabs>
-        <w:jc w:val="both"/>
-        <w:rPr>
-          <w:lang w:val="en-GB"/>
-        </w:rPr>
-      </w:pPr>
-    </w:p>
     <w:sectPr>
-      <w:headerReference w:type="default" r:id="rId11"/>
-      <w:footerReference w:type="default" r:id="rId12"/>
-      <w:pgSz w:w="11906" w:h="16838"/>
-      <w:pgMar w:top="1985" w:right="1276" w:bottom="170" w:left="1276" w:header="851" w:footer="397" w:gutter="0"/>
-      <w:cols w:space="708"/>
+      <w:pgSz w:w="12240" w:h="15840"/>
+      <w:pgMar w:top="1440" w:right="1440" w:bottom="1440" w:left="1440" w:header="720" w:footer="720" w:gutter="0"/>
+      <w:cols w:space="720"/>
       <w:docGrid w:linePitch="360"/>
     </w:sectPr>
   </w:body>

</xml_diff>